<commit_message>
added a lot of things
</commit_message>
<xml_diff>
--- a/Курсовая_Антонов.docx
+++ b/Курсовая_Антонов.docx
@@ -802,7 +802,25 @@
         <w:jc w:val="both"/>
       </w:pPr>
       <w:r>
-        <w:t>Объект исследования: деятельность предприятия «Автобусный парк» в аспектах управления техническим состоянием подвижного состава, прогнозирования пассажиропотока и планирования логистики перевозок (выпуск автобусов на линию, распределение по маршрутам).</w:t>
+        <w:t>Объект исследования:</w:t>
+      </w:r>
+      <w:r>
+        <w:t xml:space="preserve"> </w:t>
+      </w:r>
+      <w:r>
+        <w:t xml:space="preserve">ИАС </w:t>
+      </w:r>
+      <w:r>
+        <w:t>предприятия «Автобусный парк» в аспектах управления техническим состоянием подвижного состава, прогнозирования пассажиропотока</w:t>
+      </w:r>
+      <w:r>
+        <w:t xml:space="preserve"> и дневной выручки</w:t>
+      </w:r>
+      <w:r>
+        <w:t xml:space="preserve"> и п</w:t>
+      </w:r>
+      <w:r>
+        <w:t>ланирования логистики перевозок.</w:t>
       </w:r>
     </w:p>
     <w:p>
@@ -811,7 +829,19 @@
         <w:jc w:val="both"/>
       </w:pPr>
       <w:r>
-        <w:t>Предмет исследования: методы оценки технического уровня автобусов (метод относительных показателей), прогнозирования спроса на перевозки (линейная регрессия, экспоненциальное сглаживание) и оптимизации (транспортная задача, симплекс-метод для распределения рейсов по маршрутам).</w:t>
+        <w:t>Предмет исследования: методы оценки</w:t>
+      </w:r>
+      <w:r>
+        <w:t xml:space="preserve"> технического уровня автобусов, </w:t>
+      </w:r>
+      <w:r>
+        <w:t>прогн</w:t>
+      </w:r>
+      <w:r>
+        <w:t>озирования спроса на перевозки и оптимизации</w:t>
+      </w:r>
+      <w:r>
+        <w:t>.</w:t>
       </w:r>
     </w:p>
     <w:p>
@@ -941,7 +971,10 @@
         <w:jc w:val="both"/>
       </w:pPr>
       <w:r>
-        <w:t xml:space="preserve">(1) оценка технического уровня автобусов разных моделей относительно эталонных образцов с визуализацией отклонений;  </w:t>
+        <w:t>1. О</w:t>
+      </w:r>
+      <w:r>
+        <w:t xml:space="preserve">ценка технического уровня автобусов разных моделей относительно эталонных образцов с визуализацией отклонений;  </w:t>
       </w:r>
     </w:p>
     <w:p>
@@ -950,8 +983,32 @@
         <w:jc w:val="both"/>
       </w:pPr>
       <w:r>
+        <w:t>2. П</w:t>
+      </w:r>
+      <w:r>
+        <w:t xml:space="preserve">рогноз пассажиропотока на 1–12 месяцев вперёд с расчётом точности прогноза (MAPE, MAE);  </w:t>
+      </w:r>
+    </w:p>
+    <w:p>
+      <w:pPr>
+        <w:ind w:firstLine="708"/>
+        <w:jc w:val="both"/>
+      </w:pPr>
+      <w:r>
+        <w:t>3. Р</w:t>
+      </w:r>
+      <w:r>
+        <w:t xml:space="preserve">ешение транспортной задачи оптимального распределения автобусов по городским и пригородным маршрутам с минимизацией затрат на топливо и амортизацию.  </w:t>
+      </w:r>
+    </w:p>
+    <w:p>
+      <w:pPr>
+        <w:ind w:firstLine="708"/>
+        <w:jc w:val="both"/>
+      </w:pPr>
+      <w:r>
         <w:lastRenderedPageBreak/>
-        <w:t xml:space="preserve">(2) прогноз пассажиропотока на 1–12 месяцев вперёд с расчётом точности прогноза (MAPE, MAE);  </w:t>
+        <w:t>Поддерживается загрузка данных из CSV/JSON.</w:t>
       </w:r>
     </w:p>
     <w:p>
@@ -960,7 +1017,61 @@
         <w:jc w:val="both"/>
       </w:pPr>
       <w:r>
-        <w:t xml:space="preserve">(3) решение транспортной задачи оптимального распределения автобусов по городским и пригородным маршрутам с минимизацией затрат на топливо и амортизацию.  </w:t>
+        <w:t>Тех</w:t>
+      </w:r>
+      <w:r>
+        <w:t xml:space="preserve">нические показатели: </w:t>
+      </w:r>
+      <w:proofErr w:type="spellStart"/>
+      <w:r>
+        <w:t>Python</w:t>
+      </w:r>
+      <w:proofErr w:type="spellEnd"/>
+      <w:r>
+        <w:t xml:space="preserve"> 3.14</w:t>
+      </w:r>
+      <w:r>
+        <w:t xml:space="preserve">, библиотеки </w:t>
+      </w:r>
+      <w:proofErr w:type="spellStart"/>
+      <w:r>
+        <w:t>Pandas</w:t>
+      </w:r>
+      <w:proofErr w:type="spellEnd"/>
+      <w:r>
+        <w:t xml:space="preserve">, </w:t>
+      </w:r>
+      <w:proofErr w:type="spellStart"/>
+      <w:r>
+        <w:t>NumPy</w:t>
+      </w:r>
+      <w:proofErr w:type="spellEnd"/>
+      <w:r>
+        <w:t xml:space="preserve">, </w:t>
+      </w:r>
+      <w:proofErr w:type="spellStart"/>
+      <w:r>
+        <w:t>SciPy</w:t>
+      </w:r>
+      <w:proofErr w:type="spellEnd"/>
+      <w:r>
+        <w:t xml:space="preserve">, </w:t>
+      </w:r>
+      <w:proofErr w:type="spellStart"/>
+      <w:r>
+        <w:t>Plotly</w:t>
+      </w:r>
+      <w:proofErr w:type="spellEnd"/>
+      <w:r>
+        <w:t xml:space="preserve">, </w:t>
+      </w:r>
+      <w:proofErr w:type="spellStart"/>
+      <w:r>
+        <w:t>Dash</w:t>
+      </w:r>
+      <w:proofErr w:type="spellEnd"/>
+      <w:r>
+        <w:t>. Веб-интерфейс с тремя вкладками. Обработка до 50 моделей автобусов, транспортная задача размерностью до 20×20 (маршруты — автобусы), прогнозные ряды длиной 12–60 точек.</w:t>
       </w:r>
     </w:p>
     <w:p>
@@ -969,7 +1080,7 @@
         <w:jc w:val="both"/>
       </w:pPr>
       <w:r>
-        <w:t>Поддерживается загрузка данных из CSV/JSON.</w:t>
+        <w:t>Область применения: аналитические отделы, отделы качества подвижного состава и диспетчерские службы автобусных парков, управляющих городскими и пригородными пассажирскими перевозками.</w:t>
       </w:r>
     </w:p>
     <w:p>
@@ -978,79 +1089,13 @@
         <w:jc w:val="both"/>
       </w:pPr>
       <w:r>
-        <w:t>Тех</w:t>
-      </w:r>
-      <w:r>
-        <w:t xml:space="preserve">нические показатели: </w:t>
-      </w:r>
-      <w:proofErr w:type="spellStart"/>
-      <w:r>
-        <w:t>Python</w:t>
-      </w:r>
-      <w:proofErr w:type="spellEnd"/>
-      <w:r>
-        <w:t xml:space="preserve"> 3.14</w:t>
-      </w:r>
-      <w:r>
-        <w:t xml:space="preserve">, библиотеки </w:t>
-      </w:r>
-      <w:proofErr w:type="spellStart"/>
-      <w:r>
-        <w:t>Pandas</w:t>
-      </w:r>
-      <w:proofErr w:type="spellEnd"/>
-      <w:r>
-        <w:t xml:space="preserve">, </w:t>
-      </w:r>
-      <w:proofErr w:type="spellStart"/>
-      <w:r>
-        <w:t>NumPy</w:t>
-      </w:r>
-      <w:proofErr w:type="spellEnd"/>
-      <w:r>
-        <w:t xml:space="preserve">, </w:t>
-      </w:r>
-      <w:proofErr w:type="spellStart"/>
-      <w:r>
-        <w:t>SciPy</w:t>
-      </w:r>
-      <w:proofErr w:type="spellEnd"/>
-      <w:r>
-        <w:t xml:space="preserve">, </w:t>
-      </w:r>
-      <w:proofErr w:type="spellStart"/>
-      <w:r>
-        <w:t>Plotly</w:t>
-      </w:r>
-      <w:proofErr w:type="spellEnd"/>
-      <w:r>
-        <w:t xml:space="preserve">, </w:t>
-      </w:r>
-      <w:proofErr w:type="spellStart"/>
-      <w:r>
-        <w:t>Dash</w:t>
-      </w:r>
-      <w:proofErr w:type="spellEnd"/>
-      <w:r>
-        <w:t>. Веб-интерфейс с тремя вкладками. Обработка до 50 моделей автобусов, транспортная задача размерностью до 20×20 (маршруты — автобусы), прогнозные ряды длиной 12–60 точек.</w:t>
-      </w:r>
-    </w:p>
-    <w:p>
-      <w:pPr>
-        <w:ind w:firstLine="708"/>
-        <w:jc w:val="both"/>
-      </w:pPr>
-      <w:r>
-        <w:t>Область применения: аналитические отделы, отделы качества подвижного состава и диспетчерские службы автобусных парков, управляющих городскими и пригородными пассажирскими перевозками.</w:t>
-      </w:r>
-    </w:p>
-    <w:p>
-      <w:pPr>
-        <w:ind w:firstLine="708"/>
-        <w:jc w:val="both"/>
-      </w:pPr>
-      <w:r>
-        <w:t>Экономическая эффективность: сокращение времени расчётов при планировании выпуска автобусов на 65%, снижение эксплуатационных затрат на перевозки (топливо, пробег, износ) на 12–18%.</w:t>
+        <w:t>Экономическая эффективность: сокращение времени расчётов при планировании выпуска автобусов на 65%, снижение эксплуатационных затра</w:t>
+      </w:r>
+      <w:r>
+        <w:t>т на перевозки</w:t>
+      </w:r>
+      <w:r>
+        <w:t xml:space="preserve"> на 12–18%.</w:t>
       </w:r>
     </w:p>
     <w:p>
@@ -1108,21 +1153,888 @@
           <w:pPr>
             <w:pStyle w:val="af0"/>
           </w:pPr>
-          <w:r>
-            <w:t>Оглавление</w:t>
-          </w:r>
         </w:p>
         <w:p>
-          <w:fldSimple w:instr=" TOC \o &quot;1-3&quot; \h \z \u ">
-            <w:r>
-              <w:rPr>
-                <w:b/>
-                <w:bCs/>
-                <w:noProof/>
-              </w:rPr>
-              <w:t>Элементы оглавления не найдены.</w:t>
-            </w:r>
-          </w:fldSimple>
+          <w:pPr>
+            <w:pStyle w:val="11"/>
+            <w:tabs>
+              <w:tab w:val="right" w:leader="dot" w:pos="9345"/>
+            </w:tabs>
+            <w:rPr>
+              <w:rFonts w:asciiTheme="minorHAnsi" w:eastAsiaTheme="minorEastAsia" w:hAnsiTheme="minorHAnsi"/>
+              <w:noProof/>
+              <w:sz w:val="22"/>
+              <w:szCs w:val="22"/>
+              <w:lang w:eastAsia="ru-RU"/>
+            </w:rPr>
+          </w:pPr>
+          <w:r>
+            <w:fldChar w:fldCharType="begin"/>
+          </w:r>
+          <w:r>
+            <w:instrText xml:space="preserve"> TOC \o "1-3" \h \z \u </w:instrText>
+          </w:r>
+          <w:r>
+            <w:fldChar w:fldCharType="separate"/>
+          </w:r>
+          <w:hyperlink w:anchor="_Toc229738211" w:history="1">
+            <w:r>
+              <w:rPr>
+                <w:rStyle w:val="af2"/>
+                <w:noProof/>
+              </w:rPr>
+              <w:t>ВВЕДЕНИЕ</w:t>
+            </w:r>
+            <w:r>
+              <w:rPr>
+                <w:noProof/>
+                <w:webHidden/>
+              </w:rPr>
+              <w:tab/>
+            </w:r>
+            <w:r>
+              <w:rPr>
+                <w:noProof/>
+                <w:webHidden/>
+              </w:rPr>
+              <w:fldChar w:fldCharType="begin"/>
+            </w:r>
+            <w:r>
+              <w:rPr>
+                <w:noProof/>
+                <w:webHidden/>
+              </w:rPr>
+              <w:instrText xml:space="preserve"> PAGEREF _Toc229738211 \h </w:instrText>
+            </w:r>
+            <w:r>
+              <w:rPr>
+                <w:noProof/>
+                <w:webHidden/>
+              </w:rPr>
+            </w:r>
+            <w:r>
+              <w:rPr>
+                <w:noProof/>
+                <w:webHidden/>
+              </w:rPr>
+              <w:fldChar w:fldCharType="separate"/>
+            </w:r>
+            <w:r>
+              <w:rPr>
+                <w:noProof/>
+                <w:webHidden/>
+              </w:rPr>
+              <w:t>5</w:t>
+            </w:r>
+            <w:r>
+              <w:rPr>
+                <w:noProof/>
+                <w:webHidden/>
+              </w:rPr>
+              <w:fldChar w:fldCharType="end"/>
+            </w:r>
+          </w:hyperlink>
+        </w:p>
+        <w:p>
+          <w:pPr>
+            <w:pStyle w:val="11"/>
+            <w:tabs>
+              <w:tab w:val="right" w:leader="dot" w:pos="9345"/>
+            </w:tabs>
+            <w:rPr>
+              <w:rFonts w:asciiTheme="minorHAnsi" w:eastAsiaTheme="minorEastAsia" w:hAnsiTheme="minorHAnsi"/>
+              <w:noProof/>
+              <w:sz w:val="22"/>
+              <w:szCs w:val="22"/>
+              <w:lang w:eastAsia="ru-RU"/>
+            </w:rPr>
+          </w:pPr>
+          <w:hyperlink w:anchor="_Toc229738212" w:history="1">
+            <w:r>
+              <w:rPr>
+                <w:rStyle w:val="af2"/>
+                <w:noProof/>
+              </w:rPr>
+              <w:t>ЗАДАНИЕ НА КУРСОВУЮ РАБОТУ</w:t>
+            </w:r>
+            <w:r>
+              <w:rPr>
+                <w:noProof/>
+                <w:webHidden/>
+              </w:rPr>
+              <w:tab/>
+            </w:r>
+            <w:r>
+              <w:rPr>
+                <w:noProof/>
+                <w:webHidden/>
+              </w:rPr>
+              <w:fldChar w:fldCharType="begin"/>
+            </w:r>
+            <w:r>
+              <w:rPr>
+                <w:noProof/>
+                <w:webHidden/>
+              </w:rPr>
+              <w:instrText xml:space="preserve"> PAGEREF _Toc229738212 \h </w:instrText>
+            </w:r>
+            <w:r>
+              <w:rPr>
+                <w:noProof/>
+                <w:webHidden/>
+              </w:rPr>
+            </w:r>
+            <w:r>
+              <w:rPr>
+                <w:noProof/>
+                <w:webHidden/>
+              </w:rPr>
+              <w:fldChar w:fldCharType="separate"/>
+            </w:r>
+            <w:r>
+              <w:rPr>
+                <w:noProof/>
+                <w:webHidden/>
+              </w:rPr>
+              <w:t>7</w:t>
+            </w:r>
+            <w:r>
+              <w:rPr>
+                <w:noProof/>
+                <w:webHidden/>
+              </w:rPr>
+              <w:fldChar w:fldCharType="end"/>
+            </w:r>
+          </w:hyperlink>
+        </w:p>
+        <w:p>
+          <w:pPr>
+            <w:pStyle w:val="11"/>
+            <w:tabs>
+              <w:tab w:val="right" w:leader="dot" w:pos="9345"/>
+            </w:tabs>
+            <w:rPr>
+              <w:rFonts w:asciiTheme="minorHAnsi" w:eastAsiaTheme="minorEastAsia" w:hAnsiTheme="minorHAnsi"/>
+              <w:noProof/>
+              <w:sz w:val="22"/>
+              <w:szCs w:val="22"/>
+              <w:lang w:eastAsia="ru-RU"/>
+            </w:rPr>
+          </w:pPr>
+          <w:hyperlink w:anchor="_Toc229738213" w:history="1">
+            <w:r>
+              <w:rPr>
+                <w:rStyle w:val="af2"/>
+                <w:noProof/>
+              </w:rPr>
+              <w:t>ОПИСАНИЕ ПРЕДМЕТНОЙ ОБЛАСТИ</w:t>
+            </w:r>
+            <w:r>
+              <w:rPr>
+                <w:noProof/>
+                <w:webHidden/>
+              </w:rPr>
+              <w:tab/>
+            </w:r>
+            <w:r>
+              <w:rPr>
+                <w:noProof/>
+                <w:webHidden/>
+              </w:rPr>
+              <w:fldChar w:fldCharType="begin"/>
+            </w:r>
+            <w:r>
+              <w:rPr>
+                <w:noProof/>
+                <w:webHidden/>
+              </w:rPr>
+              <w:instrText xml:space="preserve"> PAGEREF _Toc229738213 \h </w:instrText>
+            </w:r>
+            <w:r>
+              <w:rPr>
+                <w:noProof/>
+                <w:webHidden/>
+              </w:rPr>
+            </w:r>
+            <w:r>
+              <w:rPr>
+                <w:noProof/>
+                <w:webHidden/>
+              </w:rPr>
+              <w:fldChar w:fldCharType="separate"/>
+            </w:r>
+            <w:r>
+              <w:rPr>
+                <w:noProof/>
+                <w:webHidden/>
+              </w:rPr>
+              <w:t>8</w:t>
+            </w:r>
+            <w:r>
+              <w:rPr>
+                <w:noProof/>
+                <w:webHidden/>
+              </w:rPr>
+              <w:fldChar w:fldCharType="end"/>
+            </w:r>
+          </w:hyperlink>
+        </w:p>
+        <w:p>
+          <w:pPr>
+            <w:pStyle w:val="11"/>
+            <w:tabs>
+              <w:tab w:val="right" w:leader="dot" w:pos="9345"/>
+            </w:tabs>
+            <w:rPr>
+              <w:rFonts w:asciiTheme="minorHAnsi" w:eastAsiaTheme="minorEastAsia" w:hAnsiTheme="minorHAnsi"/>
+              <w:noProof/>
+              <w:sz w:val="22"/>
+              <w:szCs w:val="22"/>
+              <w:lang w:eastAsia="ru-RU"/>
+            </w:rPr>
+          </w:pPr>
+          <w:hyperlink w:anchor="_Toc229738214" w:history="1">
+            <w:r>
+              <w:rPr>
+                <w:rStyle w:val="af2"/>
+                <w:noProof/>
+              </w:rPr>
+              <w:t>РАЗРАБОТКА СТРУКТУРНОЙ СХЕМЫ ПРОГРАММНОГО ПРОДУКТА</w:t>
+            </w:r>
+            <w:r>
+              <w:rPr>
+                <w:noProof/>
+                <w:webHidden/>
+              </w:rPr>
+              <w:tab/>
+            </w:r>
+            <w:r>
+              <w:rPr>
+                <w:noProof/>
+                <w:webHidden/>
+              </w:rPr>
+              <w:fldChar w:fldCharType="begin"/>
+            </w:r>
+            <w:r>
+              <w:rPr>
+                <w:noProof/>
+                <w:webHidden/>
+              </w:rPr>
+              <w:instrText xml:space="preserve"> PAGEREF _Toc229738214 \h </w:instrText>
+            </w:r>
+            <w:r>
+              <w:rPr>
+                <w:noProof/>
+                <w:webHidden/>
+              </w:rPr>
+            </w:r>
+            <w:r>
+              <w:rPr>
+                <w:noProof/>
+                <w:webHidden/>
+              </w:rPr>
+              <w:fldChar w:fldCharType="separate"/>
+            </w:r>
+            <w:r>
+              <w:rPr>
+                <w:noProof/>
+                <w:webHidden/>
+              </w:rPr>
+              <w:t>10</w:t>
+            </w:r>
+            <w:r>
+              <w:rPr>
+                <w:noProof/>
+                <w:webHidden/>
+              </w:rPr>
+              <w:fldChar w:fldCharType="end"/>
+            </w:r>
+          </w:hyperlink>
+        </w:p>
+        <w:p>
+          <w:pPr>
+            <w:pStyle w:val="11"/>
+            <w:tabs>
+              <w:tab w:val="right" w:leader="dot" w:pos="9345"/>
+            </w:tabs>
+            <w:rPr>
+              <w:rFonts w:asciiTheme="minorHAnsi" w:eastAsiaTheme="minorEastAsia" w:hAnsiTheme="minorHAnsi"/>
+              <w:noProof/>
+              <w:sz w:val="22"/>
+              <w:szCs w:val="22"/>
+              <w:lang w:eastAsia="ru-RU"/>
+            </w:rPr>
+          </w:pPr>
+          <w:hyperlink w:anchor="_Toc229738215" w:history="1">
+            <w:r>
+              <w:rPr>
+                <w:rStyle w:val="af2"/>
+                <w:noProof/>
+              </w:rPr>
+              <w:t>РЕШЕНИЕ ЗАДАЧИ ОЦЕНКИ ТЕХНИЧЕСКОГО УРОВНЯ</w:t>
+            </w:r>
+            <w:r>
+              <w:rPr>
+                <w:noProof/>
+                <w:webHidden/>
+              </w:rPr>
+              <w:tab/>
+            </w:r>
+            <w:r>
+              <w:rPr>
+                <w:noProof/>
+                <w:webHidden/>
+              </w:rPr>
+              <w:fldChar w:fldCharType="begin"/>
+            </w:r>
+            <w:r>
+              <w:rPr>
+                <w:noProof/>
+                <w:webHidden/>
+              </w:rPr>
+              <w:instrText xml:space="preserve"> PAGEREF _Toc229738215 \h </w:instrText>
+            </w:r>
+            <w:r>
+              <w:rPr>
+                <w:noProof/>
+                <w:webHidden/>
+              </w:rPr>
+            </w:r>
+            <w:r>
+              <w:rPr>
+                <w:noProof/>
+                <w:webHidden/>
+              </w:rPr>
+              <w:fldChar w:fldCharType="separate"/>
+            </w:r>
+            <w:r>
+              <w:rPr>
+                <w:noProof/>
+                <w:webHidden/>
+              </w:rPr>
+              <w:t>11</w:t>
+            </w:r>
+            <w:r>
+              <w:rPr>
+                <w:noProof/>
+                <w:webHidden/>
+              </w:rPr>
+              <w:fldChar w:fldCharType="end"/>
+            </w:r>
+          </w:hyperlink>
+        </w:p>
+        <w:p>
+          <w:pPr>
+            <w:pStyle w:val="11"/>
+            <w:tabs>
+              <w:tab w:val="right" w:leader="dot" w:pos="9345"/>
+            </w:tabs>
+            <w:rPr>
+              <w:rFonts w:asciiTheme="minorHAnsi" w:eastAsiaTheme="minorEastAsia" w:hAnsiTheme="minorHAnsi"/>
+              <w:noProof/>
+              <w:sz w:val="22"/>
+              <w:szCs w:val="22"/>
+              <w:lang w:eastAsia="ru-RU"/>
+            </w:rPr>
+          </w:pPr>
+          <w:hyperlink w:anchor="_Toc229738216" w:history="1">
+            <w:r>
+              <w:rPr>
+                <w:rStyle w:val="af2"/>
+                <w:noProof/>
+              </w:rPr>
+              <w:t>РЕШЕНИЕ ЗАДАЧИ ПРОГНОЗА ДИНАМИКИ ПОКАЗАТЕЛЕЙ</w:t>
+            </w:r>
+            <w:r>
+              <w:rPr>
+                <w:noProof/>
+                <w:webHidden/>
+              </w:rPr>
+              <w:tab/>
+            </w:r>
+            <w:r>
+              <w:rPr>
+                <w:noProof/>
+                <w:webHidden/>
+              </w:rPr>
+              <w:fldChar w:fldCharType="begin"/>
+            </w:r>
+            <w:r>
+              <w:rPr>
+                <w:noProof/>
+                <w:webHidden/>
+              </w:rPr>
+              <w:instrText xml:space="preserve"> PAGEREF _Toc229738216 \h </w:instrText>
+            </w:r>
+            <w:r>
+              <w:rPr>
+                <w:noProof/>
+                <w:webHidden/>
+              </w:rPr>
+            </w:r>
+            <w:r>
+              <w:rPr>
+                <w:noProof/>
+                <w:webHidden/>
+              </w:rPr>
+              <w:fldChar w:fldCharType="separate"/>
+            </w:r>
+            <w:r>
+              <w:rPr>
+                <w:noProof/>
+                <w:webHidden/>
+              </w:rPr>
+              <w:t>13</w:t>
+            </w:r>
+            <w:r>
+              <w:rPr>
+                <w:noProof/>
+                <w:webHidden/>
+              </w:rPr>
+              <w:fldChar w:fldCharType="end"/>
+            </w:r>
+          </w:hyperlink>
+        </w:p>
+        <w:p>
+          <w:pPr>
+            <w:pStyle w:val="11"/>
+            <w:tabs>
+              <w:tab w:val="right" w:leader="dot" w:pos="9345"/>
+            </w:tabs>
+            <w:rPr>
+              <w:rFonts w:asciiTheme="minorHAnsi" w:eastAsiaTheme="minorEastAsia" w:hAnsiTheme="minorHAnsi"/>
+              <w:noProof/>
+              <w:sz w:val="22"/>
+              <w:szCs w:val="22"/>
+              <w:lang w:eastAsia="ru-RU"/>
+            </w:rPr>
+          </w:pPr>
+          <w:hyperlink w:anchor="_Toc229738217" w:history="1">
+            <w:r>
+              <w:rPr>
+                <w:rStyle w:val="af2"/>
+                <w:noProof/>
+              </w:rPr>
+              <w:t>РЕШЕНИЕ ЗАДАЧИ ОПТИМИЗАЦИИ ПРОЦЕССА</w:t>
+            </w:r>
+            <w:r>
+              <w:rPr>
+                <w:noProof/>
+                <w:webHidden/>
+              </w:rPr>
+              <w:tab/>
+            </w:r>
+            <w:r>
+              <w:rPr>
+                <w:noProof/>
+                <w:webHidden/>
+              </w:rPr>
+              <w:fldChar w:fldCharType="begin"/>
+            </w:r>
+            <w:r>
+              <w:rPr>
+                <w:noProof/>
+                <w:webHidden/>
+              </w:rPr>
+              <w:instrText xml:space="preserve"> PAGEREF _Toc229738217 \h </w:instrText>
+            </w:r>
+            <w:r>
+              <w:rPr>
+                <w:noProof/>
+                <w:webHidden/>
+              </w:rPr>
+            </w:r>
+            <w:r>
+              <w:rPr>
+                <w:noProof/>
+                <w:webHidden/>
+              </w:rPr>
+              <w:fldChar w:fldCharType="separate"/>
+            </w:r>
+            <w:r>
+              <w:rPr>
+                <w:noProof/>
+                <w:webHidden/>
+              </w:rPr>
+              <w:t>17</w:t>
+            </w:r>
+            <w:r>
+              <w:rPr>
+                <w:noProof/>
+                <w:webHidden/>
+              </w:rPr>
+              <w:fldChar w:fldCharType="end"/>
+            </w:r>
+          </w:hyperlink>
+        </w:p>
+        <w:p>
+          <w:pPr>
+            <w:pStyle w:val="11"/>
+            <w:tabs>
+              <w:tab w:val="right" w:leader="dot" w:pos="9345"/>
+            </w:tabs>
+            <w:rPr>
+              <w:rFonts w:asciiTheme="minorHAnsi" w:eastAsiaTheme="minorEastAsia" w:hAnsiTheme="minorHAnsi"/>
+              <w:noProof/>
+              <w:sz w:val="22"/>
+              <w:szCs w:val="22"/>
+              <w:lang w:eastAsia="ru-RU"/>
+            </w:rPr>
+          </w:pPr>
+          <w:hyperlink w:anchor="_Toc229738218" w:history="1">
+            <w:r>
+              <w:rPr>
+                <w:rStyle w:val="af2"/>
+                <w:noProof/>
+              </w:rPr>
+              <w:t>ВИЗУАЛИЗАЦИЯ ДАННЫХ</w:t>
+            </w:r>
+            <w:r>
+              <w:rPr>
+                <w:noProof/>
+                <w:webHidden/>
+              </w:rPr>
+              <w:tab/>
+            </w:r>
+            <w:r>
+              <w:rPr>
+                <w:noProof/>
+                <w:webHidden/>
+              </w:rPr>
+              <w:fldChar w:fldCharType="begin"/>
+            </w:r>
+            <w:r>
+              <w:rPr>
+                <w:noProof/>
+                <w:webHidden/>
+              </w:rPr>
+              <w:instrText xml:space="preserve"> PAGEREF _Toc229738218 \h </w:instrText>
+            </w:r>
+            <w:r>
+              <w:rPr>
+                <w:noProof/>
+                <w:webHidden/>
+              </w:rPr>
+            </w:r>
+            <w:r>
+              <w:rPr>
+                <w:noProof/>
+                <w:webHidden/>
+              </w:rPr>
+              <w:fldChar w:fldCharType="separate"/>
+            </w:r>
+            <w:r>
+              <w:rPr>
+                <w:noProof/>
+                <w:webHidden/>
+              </w:rPr>
+              <w:t>19</w:t>
+            </w:r>
+            <w:r>
+              <w:rPr>
+                <w:noProof/>
+                <w:webHidden/>
+              </w:rPr>
+              <w:fldChar w:fldCharType="end"/>
+            </w:r>
+          </w:hyperlink>
+        </w:p>
+        <w:p>
+          <w:pPr>
+            <w:pStyle w:val="11"/>
+            <w:tabs>
+              <w:tab w:val="right" w:leader="dot" w:pos="9345"/>
+            </w:tabs>
+            <w:rPr>
+              <w:rFonts w:asciiTheme="minorHAnsi" w:eastAsiaTheme="minorEastAsia" w:hAnsiTheme="minorHAnsi"/>
+              <w:noProof/>
+              <w:sz w:val="22"/>
+              <w:szCs w:val="22"/>
+              <w:lang w:eastAsia="ru-RU"/>
+            </w:rPr>
+          </w:pPr>
+          <w:hyperlink w:anchor="_Toc229738219" w:history="1">
+            <w:r>
+              <w:rPr>
+                <w:rStyle w:val="af2"/>
+                <w:noProof/>
+              </w:rPr>
+              <w:t>ИНСТРУКЦИЯ ПОЛЬЗОВАТЕЛЯ ПО ЭКСПЛУАТАЦИИ ПРОГРАММНОГО ПРОДУКТА</w:t>
+            </w:r>
+            <w:r>
+              <w:rPr>
+                <w:noProof/>
+                <w:webHidden/>
+              </w:rPr>
+              <w:tab/>
+            </w:r>
+            <w:r>
+              <w:rPr>
+                <w:noProof/>
+                <w:webHidden/>
+              </w:rPr>
+              <w:fldChar w:fldCharType="begin"/>
+            </w:r>
+            <w:r>
+              <w:rPr>
+                <w:noProof/>
+                <w:webHidden/>
+              </w:rPr>
+              <w:instrText xml:space="preserve"> PAGEREF _Toc229738219 \h </w:instrText>
+            </w:r>
+            <w:r>
+              <w:rPr>
+                <w:noProof/>
+                <w:webHidden/>
+              </w:rPr>
+            </w:r>
+            <w:r>
+              <w:rPr>
+                <w:noProof/>
+                <w:webHidden/>
+              </w:rPr>
+              <w:fldChar w:fldCharType="separate"/>
+            </w:r>
+            <w:r>
+              <w:rPr>
+                <w:noProof/>
+                <w:webHidden/>
+              </w:rPr>
+              <w:t>21</w:t>
+            </w:r>
+            <w:r>
+              <w:rPr>
+                <w:noProof/>
+                <w:webHidden/>
+              </w:rPr>
+              <w:fldChar w:fldCharType="end"/>
+            </w:r>
+          </w:hyperlink>
+        </w:p>
+        <w:p>
+          <w:pPr>
+            <w:pStyle w:val="11"/>
+            <w:tabs>
+              <w:tab w:val="right" w:leader="dot" w:pos="9345"/>
+            </w:tabs>
+            <w:rPr>
+              <w:rFonts w:asciiTheme="minorHAnsi" w:eastAsiaTheme="minorEastAsia" w:hAnsiTheme="minorHAnsi"/>
+              <w:noProof/>
+              <w:sz w:val="22"/>
+              <w:szCs w:val="22"/>
+              <w:lang w:eastAsia="ru-RU"/>
+            </w:rPr>
+          </w:pPr>
+          <w:hyperlink w:anchor="_Toc229738220" w:history="1">
+            <w:r>
+              <w:rPr>
+                <w:rStyle w:val="af2"/>
+                <w:noProof/>
+              </w:rPr>
+              <w:t>ЗАКЛЮЧЕНИЕ</w:t>
+            </w:r>
+            <w:r>
+              <w:rPr>
+                <w:noProof/>
+                <w:webHidden/>
+              </w:rPr>
+              <w:tab/>
+            </w:r>
+            <w:r>
+              <w:rPr>
+                <w:noProof/>
+                <w:webHidden/>
+              </w:rPr>
+              <w:fldChar w:fldCharType="begin"/>
+            </w:r>
+            <w:r>
+              <w:rPr>
+                <w:noProof/>
+                <w:webHidden/>
+              </w:rPr>
+              <w:instrText xml:space="preserve"> PAGEREF _Toc229738220 \h </w:instrText>
+            </w:r>
+            <w:r>
+              <w:rPr>
+                <w:noProof/>
+                <w:webHidden/>
+              </w:rPr>
+            </w:r>
+            <w:r>
+              <w:rPr>
+                <w:noProof/>
+                <w:webHidden/>
+              </w:rPr>
+              <w:fldChar w:fldCharType="separate"/>
+            </w:r>
+            <w:r>
+              <w:rPr>
+                <w:noProof/>
+                <w:webHidden/>
+              </w:rPr>
+              <w:t>22</w:t>
+            </w:r>
+            <w:r>
+              <w:rPr>
+                <w:noProof/>
+                <w:webHidden/>
+              </w:rPr>
+              <w:fldChar w:fldCharType="end"/>
+            </w:r>
+          </w:hyperlink>
+        </w:p>
+        <w:p>
+          <w:pPr>
+            <w:pStyle w:val="11"/>
+            <w:tabs>
+              <w:tab w:val="right" w:leader="dot" w:pos="9345"/>
+            </w:tabs>
+            <w:rPr>
+              <w:rFonts w:asciiTheme="minorHAnsi" w:eastAsiaTheme="minorEastAsia" w:hAnsiTheme="minorHAnsi"/>
+              <w:noProof/>
+              <w:sz w:val="22"/>
+              <w:szCs w:val="22"/>
+              <w:lang w:eastAsia="ru-RU"/>
+            </w:rPr>
+          </w:pPr>
+          <w:hyperlink w:anchor="_Toc229738221" w:history="1">
+            <w:r>
+              <w:rPr>
+                <w:rStyle w:val="af2"/>
+                <w:noProof/>
+              </w:rPr>
+              <w:t>СПИСОК ИСПОЛЬЗОВАННЫХ ИСТОЧНИКОВ</w:t>
+            </w:r>
+            <w:r>
+              <w:rPr>
+                <w:noProof/>
+                <w:webHidden/>
+              </w:rPr>
+              <w:tab/>
+            </w:r>
+            <w:r>
+              <w:rPr>
+                <w:noProof/>
+                <w:webHidden/>
+              </w:rPr>
+              <w:fldChar w:fldCharType="begin"/>
+            </w:r>
+            <w:r>
+              <w:rPr>
+                <w:noProof/>
+                <w:webHidden/>
+              </w:rPr>
+              <w:instrText xml:space="preserve"> PAGEREF _Toc229738221 \h </w:instrText>
+            </w:r>
+            <w:r>
+              <w:rPr>
+                <w:noProof/>
+                <w:webHidden/>
+              </w:rPr>
+            </w:r>
+            <w:r>
+              <w:rPr>
+                <w:noProof/>
+                <w:webHidden/>
+              </w:rPr>
+              <w:fldChar w:fldCharType="separate"/>
+            </w:r>
+            <w:r>
+              <w:rPr>
+                <w:noProof/>
+                <w:webHidden/>
+              </w:rPr>
+              <w:t>23</w:t>
+            </w:r>
+            <w:r>
+              <w:rPr>
+                <w:noProof/>
+                <w:webHidden/>
+              </w:rPr>
+              <w:fldChar w:fldCharType="end"/>
+            </w:r>
+          </w:hyperlink>
+        </w:p>
+        <w:p>
+          <w:pPr>
+            <w:pStyle w:val="11"/>
+            <w:tabs>
+              <w:tab w:val="right" w:leader="dot" w:pos="9345"/>
+            </w:tabs>
+            <w:rPr>
+              <w:rFonts w:asciiTheme="minorHAnsi" w:eastAsiaTheme="minorEastAsia" w:hAnsiTheme="minorHAnsi"/>
+              <w:noProof/>
+              <w:sz w:val="22"/>
+              <w:szCs w:val="22"/>
+              <w:lang w:eastAsia="ru-RU"/>
+            </w:rPr>
+          </w:pPr>
+          <w:hyperlink w:anchor="_Toc229738222" w:history="1">
+            <w:r>
+              <w:rPr>
+                <w:rStyle w:val="af2"/>
+                <w:noProof/>
+              </w:rPr>
+              <w:t>ПРИЛОЖЕНИЕ А</w:t>
+            </w:r>
+            <w:r>
+              <w:rPr>
+                <w:noProof/>
+                <w:webHidden/>
+              </w:rPr>
+              <w:tab/>
+            </w:r>
+            <w:r>
+              <w:rPr>
+                <w:noProof/>
+                <w:webHidden/>
+              </w:rPr>
+              <w:fldChar w:fldCharType="begin"/>
+            </w:r>
+            <w:r>
+              <w:rPr>
+                <w:noProof/>
+                <w:webHidden/>
+              </w:rPr>
+              <w:instrText xml:space="preserve"> PAGEREF _Toc229738222 \h </w:instrText>
+            </w:r>
+            <w:r>
+              <w:rPr>
+                <w:noProof/>
+                <w:webHidden/>
+              </w:rPr>
+            </w:r>
+            <w:r>
+              <w:rPr>
+                <w:noProof/>
+                <w:webHidden/>
+              </w:rPr>
+              <w:fldChar w:fldCharType="separate"/>
+            </w:r>
+            <w:r>
+              <w:rPr>
+                <w:noProof/>
+                <w:webHidden/>
+              </w:rPr>
+              <w:t>24</w:t>
+            </w:r>
+            <w:r>
+              <w:rPr>
+                <w:noProof/>
+                <w:webHidden/>
+              </w:rPr>
+              <w:fldChar w:fldCharType="end"/>
+            </w:r>
+          </w:hyperlink>
+        </w:p>
+        <w:p>
+          <w:r>
+            <w:rPr>
+              <w:bCs/>
+              <w:noProof/>
+            </w:rPr>
+            <w:fldChar w:fldCharType="end"/>
+          </w:r>
         </w:p>
       </w:sdtContent>
     </w:sdt>
@@ -1146,10 +2058,12 @@
         <w:pStyle w:val="1"/>
         <w:jc w:val="center"/>
       </w:pPr>
+      <w:bookmarkStart w:id="0" w:name="_Toc229738211"/>
       <w:r>
         <w:lastRenderedPageBreak/>
         <w:t>ВВЕДЕНИЕ</w:t>
       </w:r>
+      <w:bookmarkEnd w:id="0"/>
     </w:p>
     <w:p/>
     <w:p>
@@ -1171,6 +2085,21 @@
       </w:r>
       <w:r>
         <w:t> — разработать информационно-аналитическую систему на языке Python, которая объединит три ключевых функциональных блока: оценку технического уровня продукции, прогнозирование объёмов продаж и оптимизацию транспортных перевозок.</w:t>
+      </w:r>
+    </w:p>
+    <w:p>
+      <w:pPr>
+        <w:ind w:firstLine="708"/>
+        <w:jc w:val="both"/>
+      </w:pPr>
+      <w:r>
+        <w:t>Для прогнозирования дневной выручки используются две модели регрессии: линейная регре</w:t>
+      </w:r>
+      <w:r>
+        <w:t xml:space="preserve">ссия и полиномиальная регрессия. </w:t>
+      </w:r>
+      <w:r>
+        <w:t>Линейная регрессия предполагает линейную зависимость между признаками и целевым показателем, что позволяет выявить общие тренды. Полиномиальная регрессия учитывает нелинейные эффекты, такие как квадратичные зависимости и взаимодействия между признаками, что может повысить точность прогноза при наличии сложных взаимосвязей в данных.</w:t>
       </w:r>
     </w:p>
     <w:p>
@@ -1235,7 +2164,19 @@
         <w:jc w:val="both"/>
       </w:pPr>
       <w:r>
-        <w:t>Разработать алгоритм прогнозирования динамики продаж на основе исторических данных.</w:t>
+        <w:t xml:space="preserve">Разработать алгоритм прогнозирования </w:t>
+      </w:r>
+      <w:r>
+        <w:t>дневной выручки</w:t>
+      </w:r>
+      <w:r>
+        <w:t xml:space="preserve"> на основе </w:t>
+      </w:r>
+      <w:r>
+        <w:t>методов линейной и полиномиальной регрессии</w:t>
+      </w:r>
+      <w:r>
+        <w:t>.</w:t>
       </w:r>
     </w:p>
     <w:p>
@@ -1249,6 +2190,7 @@
         <w:jc w:val="both"/>
       </w:pPr>
       <w:r>
+        <w:lastRenderedPageBreak/>
         <w:t>Реализовать модуль оптимизации логистики для минимизации затрат на доставку техники со складов к заказчикам.</w:t>
       </w:r>
     </w:p>
@@ -1263,7 +2205,13 @@
         <w:jc w:val="both"/>
       </w:pPr>
       <w:r>
-        <w:t>Создать удобный пользовательский интерфейс (веб-дашборд) для ввода данных, запуска расчётов и просмотра результатов в виде интерактивных графиков и таблиц.</w:t>
+        <w:t>Создать удобный пользова</w:t>
+      </w:r>
+      <w:r>
+        <w:t>тельский интерфейс</w:t>
+      </w:r>
+      <w:r>
+        <w:t xml:space="preserve"> для ввода данных, запуска расчётов и просмотра результатов в виде интерактивных графиков и таблиц.</w:t>
       </w:r>
     </w:p>
     <w:p>
@@ -1286,7 +2234,6 @@
         <w:jc w:val="both"/>
       </w:pPr>
       <w:r>
-        <w:lastRenderedPageBreak/>
         <w:t>Практическая значимость работы</w:t>
       </w:r>
       <w:r>
@@ -1312,17 +2259,14 @@
         <w:pStyle w:val="1"/>
         <w:jc w:val="center"/>
       </w:pPr>
-      <w:bookmarkStart w:id="0" w:name="_Toc229241529"/>
+      <w:bookmarkStart w:id="1" w:name="_Toc229241529"/>
+      <w:bookmarkStart w:id="2" w:name="_Toc229738212"/>
       <w:r>
         <w:lastRenderedPageBreak/>
         <w:t>ЗАДАНИЕ НА КУРСОВУЮ РАБОТУ</w:t>
       </w:r>
-      <w:bookmarkEnd w:id="0"/>
-    </w:p>
-    <w:p>
-      <w:pPr>
-        <w:jc w:val="both"/>
-      </w:pPr>
+      <w:bookmarkEnd w:id="1"/>
+      <w:bookmarkEnd w:id="2"/>
     </w:p>
     <w:p>
       <w:pPr>
@@ -1330,13 +2274,6 @@
         <w:spacing w:before="240" w:after="240"/>
         <w:ind w:firstLine="709"/>
         <w:jc w:val="both"/>
-        <w:rPr>
-          <w:rFonts w:eastAsia="Times New Roman" w:cs="Times New Roman"/>
-          <w:color w:val="262626" w:themeColor="text1" w:themeTint="D9"/>
-          <w:lang w:eastAsia="ru-RU"/>
-        </w:rPr>
-      </w:pPr>
-      <w:r>
         <w:rPr>
           <w:rFonts w:eastAsia="Times New Roman" w:cs="Times New Roman"/>
           <w:b/>
@@ -1344,51 +2281,43 @@
           <w:color w:val="262626" w:themeColor="text1" w:themeTint="D9"/>
           <w:lang w:eastAsia="ru-RU"/>
         </w:rPr>
-        <w:t>Исходные данные</w:t>
-      </w:r>
-    </w:p>
-    <w:p>
-      <w:pPr>
-        <w:shd w:val="clear" w:color="auto" w:fill="FFFFFF" w:themeFill="background1"/>
-        <w:spacing w:before="240" w:after="240"/>
-        <w:ind w:firstLine="709"/>
-        <w:jc w:val="both"/>
+      </w:pPr>
+      <w:r>
         <w:rPr>
           <w:rFonts w:eastAsia="Times New Roman" w:cs="Times New Roman"/>
           <w:color w:val="262626" w:themeColor="text1" w:themeTint="D9"/>
           <w:lang w:eastAsia="ru-RU"/>
         </w:rPr>
-      </w:pPr>
-      <w:r>
+        <w:t>Автобусный парк эксплуатирует три типа подвижного состава: междугородние автобусы, автобусы малой вместимости, спецтранспорт (эвакуаторы автобусов). Для оценки технического уровня автобусов необходимо выбрать набор характеристик для каждого типа подвижного состава. Для прогнозирования требуются исторические данные о пассажиропотоке или дневной выручке (не менее 12 месяцев). Для транспортной задачи нужны данные о маршрутах, автобусах и стоимости выполнения рейсов.</w:t>
+      </w:r>
+    </w:p>
+    <w:p>
+      <w:pPr>
+        <w:shd w:val="clear" w:color="auto" w:fill="FFFFFF" w:themeFill="background1"/>
+        <w:spacing w:before="240" w:after="240"/>
+        <w:ind w:firstLine="709"/>
+        <w:jc w:val="both"/>
         <w:rPr>
           <w:rFonts w:eastAsia="Times New Roman" w:cs="Times New Roman"/>
           <w:color w:val="262626" w:themeColor="text1" w:themeTint="D9"/>
           <w:lang w:eastAsia="ru-RU"/>
         </w:rPr>
-        <w:t>Автобусный парк эксплуатирует три типа подвижного состава: междугородние автобусы, автобусы малой вместимости, спецтранспорт (эвакуаторы автобусов). Для оценки технического уровня автобусов необходимо выбрать набор характеристик для каждого типа подвижного состава. Для прогнозирования требуются исторические данные о пассажиропотоке или дневной выручке (не менее 12 месяцев). Для транспортной задачи нужны данные о маршрутах, автобусах и стоимости выполнения рейсов.</w:t>
-      </w:r>
-    </w:p>
-    <w:p>
-      <w:pPr>
-        <w:shd w:val="clear" w:color="auto" w:fill="FFFFFF" w:themeFill="background1"/>
-        <w:spacing w:before="240" w:after="240"/>
-        <w:ind w:firstLine="709"/>
-        <w:jc w:val="both"/>
+      </w:pPr>
+      <w:r>
         <w:rPr>
           <w:rFonts w:eastAsia="Times New Roman" w:cs="Times New Roman"/>
           <w:color w:val="262626" w:themeColor="text1" w:themeTint="D9"/>
           <w:lang w:eastAsia="ru-RU"/>
         </w:rPr>
-      </w:pPr>
+        <w:t xml:space="preserve"> </w:t>
+      </w:r>
       <w:r>
         <w:rPr>
           <w:rFonts w:eastAsia="Times New Roman" w:cs="Times New Roman"/>
-          <w:b/>
-          <w:bCs/>
           <w:color w:val="262626" w:themeColor="text1" w:themeTint="D9"/>
           <w:lang w:eastAsia="ru-RU"/>
         </w:rPr>
-        <w:t>Что нужно разработать</w:t>
+        <w:t>Модуль оценки технического уровня автобусов. Он должен позволять выбирать тип подвижного состава, загружать данные из файла (CSV/JSON) или вводить вручную, добавлять несколько образцов для сравнения. Программа рассчитывает относительные показатели качества и выводит радиальную и столбчатую диаграммы.</w:t>
       </w:r>
     </w:p>
     <w:p>
@@ -1413,7 +2342,15 @@
           <w:color w:val="262626" w:themeColor="text1" w:themeTint="D9"/>
           <w:lang w:eastAsia="ru-RU"/>
         </w:rPr>
-        <w:t>Модуль оценки технического уровня автобусов. Он должен позволять выбирать тип подвижного состава, загружать данные из файла (CSV/JSON) или вводить вручную, добавлять несколько образцов для сравнения. Программа рассчитывает относительные показатели качества и выводит радиальную и столбчатую диаграммы.</w:t>
+        <w:t>Модуль прогнозирования дневной выручки</w:t>
+      </w:r>
+      <w:r>
+        <w:rPr>
+          <w:rFonts w:eastAsia="Times New Roman" w:cs="Times New Roman"/>
+          <w:color w:val="262626" w:themeColor="text1" w:themeTint="D9"/>
+          <w:lang w:eastAsia="ru-RU"/>
+        </w:rPr>
+        <w:t>. Он должен загружать исторические данные, строить прогноз на заданный период и показывать результат на графике.</w:t>
       </w:r>
     </w:p>
     <w:p>
@@ -1438,15 +2375,7 @@
           <w:color w:val="262626" w:themeColor="text1" w:themeTint="D9"/>
           <w:lang w:eastAsia="ru-RU"/>
         </w:rPr>
-        <w:t>Модуль прогнозирования дневной выручки</w:t>
-      </w:r>
-      <w:r>
-        <w:rPr>
-          <w:rFonts w:eastAsia="Times New Roman" w:cs="Times New Roman"/>
-          <w:color w:val="262626" w:themeColor="text1" w:themeTint="D9"/>
-          <w:lang w:eastAsia="ru-RU"/>
-        </w:rPr>
-        <w:t>. Он должен загружать исторические данные, строить прогноз на заданный период и показывать результат на графике.</w:t>
+        <w:t>Модуль оптимизации (транспортная задача). Он должен находить оптимальный план распределения автобусов по маршрутам и выводить результат в виде таблицы.</w:t>
       </w:r>
     </w:p>
     <w:p>
@@ -1471,32 +2400,25 @@
           <w:color w:val="262626" w:themeColor="text1" w:themeTint="D9"/>
           <w:lang w:eastAsia="ru-RU"/>
         </w:rPr>
-        <w:t>Модуль оптимизации (транспортная задача). Он должен находить оптимальный план распределения автобусов по маршрутам и выводить результат в виде таблицы.</w:t>
-      </w:r>
-    </w:p>
-    <w:p>
-      <w:pPr>
-        <w:numPr>
-          <w:ilvl w:val="0"/>
-          <w:numId w:val="12"/>
-        </w:numPr>
-        <w:shd w:val="clear" w:color="auto" w:fill="FFFFFF" w:themeFill="background1"/>
-        <w:spacing w:before="100" w:beforeAutospacing="1"/>
-        <w:ind w:left="0" w:firstLine="709"/>
-        <w:jc w:val="both"/>
+        <w:t>Единый веб-</w:t>
+      </w:r>
+      <w:proofErr w:type="spellStart"/>
+      <w:r>
         <w:rPr>
           <w:rFonts w:eastAsia="Times New Roman" w:cs="Times New Roman"/>
           <w:color w:val="262626" w:themeColor="text1" w:themeTint="D9"/>
           <w:lang w:eastAsia="ru-RU"/>
         </w:rPr>
-      </w:pPr>
+        <w:t>дашборд</w:t>
+      </w:r>
+      <w:proofErr w:type="spellEnd"/>
       <w:r>
         <w:rPr>
           <w:rFonts w:eastAsia="Times New Roman" w:cs="Times New Roman"/>
           <w:color w:val="262626" w:themeColor="text1" w:themeTint="D9"/>
           <w:lang w:eastAsia="ru-RU"/>
         </w:rPr>
-        <w:t>Единый веб-</w:t>
+        <w:t xml:space="preserve"> на базе </w:t>
       </w:r>
       <w:proofErr w:type="spellStart"/>
       <w:r>
@@ -1505,7 +2427,7 @@
           <w:color w:val="262626" w:themeColor="text1" w:themeTint="D9"/>
           <w:lang w:eastAsia="ru-RU"/>
         </w:rPr>
-        <w:t>дашборд</w:t>
+        <w:t>Dash</w:t>
       </w:r>
       <w:proofErr w:type="spellEnd"/>
       <w:r>
@@ -1514,43 +2436,24 @@
           <w:color w:val="262626" w:themeColor="text1" w:themeTint="D9"/>
           <w:lang w:eastAsia="ru-RU"/>
         </w:rPr>
-        <w:t xml:space="preserve"> на базе </w:t>
-      </w:r>
-      <w:proofErr w:type="spellStart"/>
-      <w:r>
+        <w:t>, объединяющий все три модуля.</w:t>
+      </w:r>
+    </w:p>
+    <w:p>
+      <w:pPr>
+        <w:shd w:val="clear" w:color="auto" w:fill="FFFFFF" w:themeFill="background1"/>
+        <w:spacing w:before="240" w:after="240"/>
+        <w:ind w:firstLine="709"/>
+        <w:jc w:val="both"/>
         <w:rPr>
           <w:rFonts w:eastAsia="Times New Roman" w:cs="Times New Roman"/>
           <w:color w:val="262626" w:themeColor="text1" w:themeTint="D9"/>
           <w:lang w:eastAsia="ru-RU"/>
         </w:rPr>
-        <w:t>Dash</w:t>
-      </w:r>
-      <w:proofErr w:type="spellEnd"/>
+      </w:pPr>
       <w:r>
         <w:rPr>
           <w:rFonts w:eastAsia="Times New Roman" w:cs="Times New Roman"/>
-          <w:color w:val="262626" w:themeColor="text1" w:themeTint="D9"/>
-          <w:lang w:eastAsia="ru-RU"/>
-        </w:rPr>
-        <w:t>, объединяющий все три модуля.</w:t>
-      </w:r>
-    </w:p>
-    <w:p>
-      <w:pPr>
-        <w:shd w:val="clear" w:color="auto" w:fill="FFFFFF" w:themeFill="background1"/>
-        <w:spacing w:before="240" w:after="240"/>
-        <w:ind w:firstLine="709"/>
-        <w:jc w:val="both"/>
-        <w:rPr>
-          <w:rFonts w:eastAsia="Times New Roman" w:cs="Times New Roman"/>
-          <w:color w:val="262626" w:themeColor="text1" w:themeTint="D9"/>
-          <w:lang w:eastAsia="ru-RU"/>
-        </w:rPr>
-      </w:pPr>
-      <w:r>
-        <w:rPr>
-          <w:rFonts w:eastAsia="Times New Roman" w:cs="Times New Roman"/>
-          <w:b/>
           <w:bCs/>
           <w:color w:val="262626" w:themeColor="text1" w:themeTint="D9"/>
           <w:lang w:eastAsia="ru-RU"/>
@@ -1600,6 +2503,100 @@
         </w:rPr>
         <w:t xml:space="preserve"> 3.14</w:t>
       </w:r>
+      <w:r>
+        <w:rPr>
+          <w:rFonts w:eastAsia="Times New Roman" w:cs="Times New Roman"/>
+          <w:color w:val="262626" w:themeColor="text1" w:themeTint="D9"/>
+          <w:lang w:eastAsia="ru-RU"/>
+        </w:rPr>
+        <w:t>, б</w:t>
+      </w:r>
+      <w:r>
+        <w:rPr>
+          <w:rFonts w:eastAsia="Times New Roman" w:cs="Times New Roman"/>
+          <w:color w:val="262626" w:themeColor="text1" w:themeTint="D9"/>
+          <w:lang w:eastAsia="ru-RU"/>
+        </w:rPr>
+        <w:t xml:space="preserve">иблиотеки: </w:t>
+      </w:r>
+      <w:r>
+        <w:rPr>
+          <w:rFonts w:eastAsia="Times New Roman" w:cs="Times New Roman"/>
+          <w:color w:val="262626" w:themeColor="text1" w:themeTint="D9"/>
+          <w:lang w:val="en-US" w:eastAsia="ru-RU"/>
+        </w:rPr>
+        <w:t>Pandas</w:t>
+      </w:r>
+      <w:r>
+        <w:rPr>
+          <w:rFonts w:eastAsia="Times New Roman" w:cs="Times New Roman"/>
+          <w:color w:val="262626" w:themeColor="text1" w:themeTint="D9"/>
+          <w:lang w:eastAsia="ru-RU"/>
+        </w:rPr>
+        <w:t xml:space="preserve">, </w:t>
+      </w:r>
+      <w:proofErr w:type="spellStart"/>
+      <w:r>
+        <w:rPr>
+          <w:rFonts w:eastAsia="Times New Roman" w:cs="Times New Roman"/>
+          <w:color w:val="262626" w:themeColor="text1" w:themeTint="D9"/>
+          <w:lang w:val="en-US" w:eastAsia="ru-RU"/>
+        </w:rPr>
+        <w:t>NumPy</w:t>
+      </w:r>
+      <w:proofErr w:type="spellEnd"/>
+      <w:r>
+        <w:rPr>
+          <w:rFonts w:eastAsia="Times New Roman" w:cs="Times New Roman"/>
+          <w:color w:val="262626" w:themeColor="text1" w:themeTint="D9"/>
+          <w:lang w:eastAsia="ru-RU"/>
+        </w:rPr>
+        <w:t xml:space="preserve">, </w:t>
+      </w:r>
+      <w:proofErr w:type="spellStart"/>
+      <w:r>
+        <w:rPr>
+          <w:rFonts w:eastAsia="Times New Roman" w:cs="Times New Roman"/>
+          <w:color w:val="262626" w:themeColor="text1" w:themeTint="D9"/>
+          <w:lang w:val="en-US" w:eastAsia="ru-RU"/>
+        </w:rPr>
+        <w:t>SciPy</w:t>
+      </w:r>
+      <w:proofErr w:type="spellEnd"/>
+      <w:r>
+        <w:rPr>
+          <w:rFonts w:eastAsia="Times New Roman" w:cs="Times New Roman"/>
+          <w:color w:val="262626" w:themeColor="text1" w:themeTint="D9"/>
+          <w:lang w:eastAsia="ru-RU"/>
+        </w:rPr>
+        <w:t xml:space="preserve">, </w:t>
+      </w:r>
+      <w:proofErr w:type="spellStart"/>
+      <w:r>
+        <w:rPr>
+          <w:rFonts w:eastAsia="Times New Roman" w:cs="Times New Roman"/>
+          <w:color w:val="262626" w:themeColor="text1" w:themeTint="D9"/>
+          <w:lang w:val="en-US" w:eastAsia="ru-RU"/>
+        </w:rPr>
+        <w:t>Plotly</w:t>
+      </w:r>
+      <w:proofErr w:type="spellEnd"/>
+      <w:r>
+        <w:rPr>
+          <w:rFonts w:eastAsia="Times New Roman" w:cs="Times New Roman"/>
+          <w:color w:val="262626" w:themeColor="text1" w:themeTint="D9"/>
+          <w:lang w:eastAsia="ru-RU"/>
+        </w:rPr>
+        <w:t xml:space="preserve">, </w:t>
+      </w:r>
+      <w:r>
+        <w:rPr>
+          <w:rFonts w:eastAsia="Times New Roman" w:cs="Times New Roman"/>
+          <w:color w:val="262626" w:themeColor="text1" w:themeTint="D9"/>
+          <w:lang w:val="en-US" w:eastAsia="ru-RU"/>
+        </w:rPr>
+        <w:t>Dash</w:t>
+      </w:r>
     </w:p>
     <w:p>
       <w:pPr>
@@ -1614,7 +2611,7 @@
         <w:rPr>
           <w:rFonts w:eastAsia="Times New Roman" w:cs="Times New Roman"/>
           <w:color w:val="262626" w:themeColor="text1" w:themeTint="D9"/>
-          <w:lang w:val="en-US" w:eastAsia="ru-RU"/>
+          <w:lang w:eastAsia="ru-RU"/>
         </w:rPr>
       </w:pPr>
       <w:r>
@@ -1623,69 +2620,7 @@
           <w:color w:val="262626" w:themeColor="text1" w:themeTint="D9"/>
           <w:lang w:eastAsia="ru-RU"/>
         </w:rPr>
-        <w:t>Библиотеки</w:t>
-      </w:r>
-      <w:r>
-        <w:rPr>
-          <w:rFonts w:eastAsia="Times New Roman" w:cs="Times New Roman"/>
-          <w:color w:val="262626" w:themeColor="text1" w:themeTint="D9"/>
-          <w:lang w:val="en-US" w:eastAsia="ru-RU"/>
-        </w:rPr>
-        <w:t xml:space="preserve">: Pandas, </w:t>
-      </w:r>
-      <w:proofErr w:type="spellStart"/>
-      <w:r>
-        <w:rPr>
-          <w:rFonts w:eastAsia="Times New Roman" w:cs="Times New Roman"/>
-          <w:color w:val="262626" w:themeColor="text1" w:themeTint="D9"/>
-          <w:lang w:val="en-US" w:eastAsia="ru-RU"/>
-        </w:rPr>
-        <w:t>NumPy</w:t>
-      </w:r>
-      <w:proofErr w:type="spellEnd"/>
-      <w:r>
-        <w:rPr>
-          <w:rFonts w:eastAsia="Times New Roman" w:cs="Times New Roman"/>
-          <w:color w:val="262626" w:themeColor="text1" w:themeTint="D9"/>
-          <w:lang w:val="en-US" w:eastAsia="ru-RU"/>
-        </w:rPr>
-        <w:t xml:space="preserve">, </w:t>
-      </w:r>
-      <w:proofErr w:type="spellStart"/>
-      <w:r>
-        <w:rPr>
-          <w:rFonts w:eastAsia="Times New Roman" w:cs="Times New Roman"/>
-          <w:color w:val="262626" w:themeColor="text1" w:themeTint="D9"/>
-          <w:lang w:val="en-US" w:eastAsia="ru-RU"/>
-        </w:rPr>
-        <w:t>SciPy</w:t>
-      </w:r>
-      <w:proofErr w:type="spellEnd"/>
-      <w:r>
-        <w:rPr>
-          <w:rFonts w:eastAsia="Times New Roman" w:cs="Times New Roman"/>
-          <w:color w:val="262626" w:themeColor="text1" w:themeTint="D9"/>
-          <w:lang w:val="en-US" w:eastAsia="ru-RU"/>
-        </w:rPr>
-        <w:t xml:space="preserve">, </w:t>
-      </w:r>
-      <w:proofErr w:type="spellStart"/>
-      <w:r>
-        <w:rPr>
-          <w:rFonts w:eastAsia="Times New Roman" w:cs="Times New Roman"/>
-          <w:color w:val="262626" w:themeColor="text1" w:themeTint="D9"/>
-          <w:lang w:val="en-US" w:eastAsia="ru-RU"/>
-        </w:rPr>
-        <w:t>Plotly</w:t>
-      </w:r>
-      <w:proofErr w:type="spellEnd"/>
-      <w:r>
-        <w:rPr>
-          <w:rFonts w:eastAsia="Times New Roman" w:cs="Times New Roman"/>
-          <w:color w:val="262626" w:themeColor="text1" w:themeTint="D9"/>
-          <w:lang w:val="en-US" w:eastAsia="ru-RU"/>
-        </w:rPr>
-        <w:t>, Dash</w:t>
+        <w:t>Данные хранятся в файлах CSV или JSON</w:t>
       </w:r>
     </w:p>
     <w:p>
@@ -1710,8 +2645,7 @@
           <w:color w:val="262626" w:themeColor="text1" w:themeTint="D9"/>
           <w:lang w:eastAsia="ru-RU"/>
         </w:rPr>
-        <w:lastRenderedPageBreak/>
-        <w:t>Данные хранятся в файлах CSV или JSON</w:t>
+        <w:t>Код написан в объектно-ориентированном стиле</w:t>
       </w:r>
     </w:p>
     <w:p>
@@ -1736,74 +2670,32 @@
           <w:color w:val="262626" w:themeColor="text1" w:themeTint="D9"/>
           <w:lang w:eastAsia="ru-RU"/>
         </w:rPr>
-        <w:t>Код написан в объектно-ориентированном стиле</w:t>
-      </w:r>
-    </w:p>
-    <w:p>
-      <w:pPr>
-        <w:numPr>
-          <w:ilvl w:val="0"/>
-          <w:numId w:val="13"/>
-        </w:numPr>
-        <w:shd w:val="clear" w:color="auto" w:fill="FFFFFF" w:themeFill="background1"/>
-        <w:spacing w:before="100" w:beforeAutospacing="1"/>
-        <w:ind w:left="0" w:firstLine="709"/>
-        <w:jc w:val="both"/>
+        <w:t xml:space="preserve">Код размещён на </w:t>
+      </w:r>
+      <w:proofErr w:type="spellStart"/>
+      <w:r>
         <w:rPr>
           <w:rFonts w:eastAsia="Times New Roman" w:cs="Times New Roman"/>
           <w:color w:val="262626" w:themeColor="text1" w:themeTint="D9"/>
           <w:lang w:eastAsia="ru-RU"/>
         </w:rPr>
-      </w:pPr>
-      <w:r>
-        <w:rPr>
-          <w:rFonts w:eastAsia="Times New Roman" w:cs="Times New Roman"/>
-          <w:color w:val="262626" w:themeColor="text1" w:themeTint="D9"/>
-          <w:lang w:eastAsia="ru-RU"/>
-        </w:rPr>
-        <w:t xml:space="preserve">Код размещён на </w:t>
-      </w:r>
-      <w:proofErr w:type="spellStart"/>
-      <w:r>
-        <w:rPr>
-          <w:rFonts w:eastAsia="Times New Roman" w:cs="Times New Roman"/>
-          <w:color w:val="262626" w:themeColor="text1" w:themeTint="D9"/>
-          <w:lang w:eastAsia="ru-RU"/>
-        </w:rPr>
         <w:t>GitHub</w:t>
       </w:r>
       <w:proofErr w:type="spellEnd"/>
-    </w:p>
-    <w:p>
-      <w:pPr>
-        <w:spacing w:after="160" w:line="278" w:lineRule="auto"/>
-        <w:ind w:firstLine="709"/>
-        <w:rPr>
-          <w:rFonts w:eastAsia="Times New Roman" w:cs="Times New Roman"/>
-          <w:color w:val="262626" w:themeColor="text1" w:themeTint="D9"/>
-          <w:lang w:eastAsia="ru-RU"/>
-        </w:rPr>
-      </w:pPr>
-      <w:r>
-        <w:rPr>
-          <w:rFonts w:eastAsia="Times New Roman" w:cs="Times New Roman"/>
-          <w:color w:val="262626" w:themeColor="text1" w:themeTint="D9"/>
-          <w:lang w:eastAsia="ru-RU"/>
-        </w:rPr>
-        <w:br w:type="page"/>
-      </w:r>
     </w:p>
     <w:p>
       <w:pPr>
         <w:pStyle w:val="1"/>
         <w:jc w:val="center"/>
       </w:pPr>
-      <w:bookmarkStart w:id="1" w:name="_Toc229241530"/>
+      <w:bookmarkStart w:id="3" w:name="_Toc229241530"/>
+      <w:bookmarkStart w:id="4" w:name="_Toc229738213"/>
       <w:r>
         <w:lastRenderedPageBreak/>
         <w:t>ОПИСАНИЕ ПРЕДМЕТНОЙ ОБЛАСТИ</w:t>
       </w:r>
-      <w:bookmarkEnd w:id="1"/>
+      <w:bookmarkEnd w:id="3"/>
+      <w:bookmarkEnd w:id="4"/>
     </w:p>
     <w:p>
       <w:pPr>
@@ -1818,7 +2710,7 @@
           <w14:ligatures w14:val="none"/>
         </w:rPr>
       </w:pPr>
-      <w:bookmarkStart w:id="2" w:name="_Toc229241531"/>
+      <w:bookmarkStart w:id="5" w:name="_Toc229241531"/>
     </w:p>
     <w:p>
       <w:pPr>
@@ -2045,16 +2937,21 @@
         <w:br w:type="page"/>
       </w:r>
     </w:p>
-    <w:p/>
     <w:p>
       <w:pPr>
         <w:pStyle w:val="1"/>
         <w:jc w:val="center"/>
       </w:pPr>
-      <w:r>
+      <w:bookmarkStart w:id="6" w:name="_Toc229738214"/>
+      <w:r>
+        <w:lastRenderedPageBreak/>
         <w:t>РАЗРАБОТКА СТРУКТУРНОЙ СХЕМЫ ПРОГРАММНОГО ПРОДУКТА</w:t>
       </w:r>
-      <w:bookmarkEnd w:id="2"/>
+      <w:bookmarkEnd w:id="5"/>
+      <w:bookmarkEnd w:id="6"/>
+      <w:r>
+        <w:t xml:space="preserve"> </w:t>
+      </w:r>
     </w:p>
     <w:p/>
     <w:p>
@@ -2063,10 +2960,7 @@
         <w:jc w:val="both"/>
       </w:pPr>
       <w:r>
-        <w:t>Программа состоит из трёх независимых модулей, объе</w:t>
-      </w:r>
-      <w:r>
-        <w:t>динённых общим веб-интерфейсом.</w:t>
+        <w:t>Программа состоит из трёх независимых модулей, объединённых общим веб-интерфейсом.</w:t>
       </w:r>
     </w:p>
     <w:p>
@@ -2075,10 +2969,7 @@
         <w:jc w:val="both"/>
       </w:pPr>
       <w:r>
-        <w:t>Модуль оценки качества позволяет пользователю выбрать тип подвижного состава (междугородний автобус, автобус малой вместимости, спецтранспорт), загрузить данные из файла или ввести их вручную. Программа рассчитывает относительные показатели качества и отображает рад</w:t>
-      </w:r>
-      <w:r>
-        <w:t>иальную и столбчатую диаграммы.</w:t>
+        <w:t>Модуль оценки качества позволяет пользователю выбрать тип подвижного состава (междугородний автобус, автобус малой вместимости, спецтранспорт), загрузить данные из файла или ввести их вручную. Программа рассчитывает относительные показатели качества и отображает радиальную и столбчатую диаграммы.</w:t>
       </w:r>
     </w:p>
     <w:p>
@@ -2087,10 +2978,7 @@
         <w:jc w:val="both"/>
       </w:pPr>
       <w:r>
-        <w:t>Модуль прогнозирования загружает исторические данные о пассажиропотоке (или дневной выручке), строит прогноз на заданный период времени (линейная или полиномиальн</w:t>
-      </w:r>
-      <w:r>
-        <w:t>ая регрессия) и выводит график.</w:t>
+        <w:t>Модуль прогнозирования загружает исторические данные о пассажиропотоке (или дневной выручке), строит прогноз на заданный период времени (линейная или полиномиальная регрессия) и выводит график.</w:t>
       </w:r>
     </w:p>
     <w:p>
@@ -2099,10 +2987,7 @@
         <w:jc w:val="both"/>
       </w:pPr>
       <w:r>
-        <w:t>Модуль транспортной задачи загружает данные о маршрутах, автобусах и стоимости выполнения рейсов, находит оптимальный план распределения автобусов по маршрутам и</w:t>
-      </w:r>
-      <w:r>
-        <w:t xml:space="preserve"> отображает его в виде таблицы.</w:t>
+        <w:t>Модуль транспортной задачи загружает данные о маршрутах, автобусах и стоимости выполнения рейсов, находит оптимальный план распределения автобусов по маршрутам и отображает его в виде таблицы.</w:t>
       </w:r>
     </w:p>
     <w:p>
@@ -2135,10 +3020,7 @@
       </w:r>
       <w:proofErr w:type="spellEnd"/>
       <w:r>
-        <w:t xml:space="preserve"> имеет три вклад</w:t>
-      </w:r>
-      <w:r>
-        <w:t>ки — по одной на каждый модуль.</w:t>
+        <w:t xml:space="preserve"> имеет три вкладки — по одной на каждый модуль.</w:t>
       </w:r>
     </w:p>
     <w:p>
@@ -2187,12 +3069,14 @@
         <w:pStyle w:val="1"/>
         <w:jc w:val="center"/>
       </w:pPr>
-      <w:bookmarkStart w:id="3" w:name="_Toc229241532"/>
+      <w:bookmarkStart w:id="7" w:name="_Toc229241532"/>
+      <w:bookmarkStart w:id="8" w:name="_Toc229738215"/>
       <w:r>
         <w:lastRenderedPageBreak/>
         <w:t>РЕШЕНИЕ ЗАДАЧИ ОЦЕНКИ ТЕХНИЧЕСКОГО УРОВНЯ</w:t>
       </w:r>
-      <w:bookmarkEnd w:id="3"/>
+      <w:bookmarkEnd w:id="7"/>
+      <w:bookmarkEnd w:id="8"/>
     </w:p>
     <w:p/>
     <w:p>
@@ -2201,70 +3085,64 @@
         <w:jc w:val="both"/>
       </w:pPr>
       <w:r>
-        <w:t>Для оценки технического уровня выбран метод относительных показателей. Суть метода: каждый показатель качества оцениваемого образца сравнивается с таким же показателем эталонного образца. В результате получается относительное число, показывающее, лучше или хуж</w:t>
-      </w:r>
-      <w:r>
-        <w:t>е образец по данному параметру.</w:t>
-      </w:r>
-    </w:p>
-    <w:p>
-      <w:pPr>
-        <w:ind w:firstLine="709"/>
-        <w:jc w:val="both"/>
-      </w:pPr>
-      <w:r>
-        <w:t>Данный метод является простым, понятным и позволяет сравнивать разные образцы по разнородным показателям (максимальная скорость, расход топлива, комфорт и т.д.). Все показатели приводятся к безразмерному виду, что делае</w:t>
-      </w:r>
-      <w:r>
-        <w:t>т их сопоставимыми между собой.</w:t>
-      </w:r>
-    </w:p>
-    <w:p>
-      <w:pPr>
-        <w:ind w:firstLine="709"/>
-        <w:jc w:val="both"/>
-      </w:pPr>
-      <w:r>
-        <w:t>Для каждого типа подвижного сост</w:t>
-      </w:r>
-      <w:r>
-        <w:t>ава выбрано по 4–5 показателей.</w:t>
-      </w:r>
-    </w:p>
-    <w:p>
-      <w:pPr>
-        <w:ind w:firstLine="709"/>
-        <w:jc w:val="both"/>
-      </w:pPr>
-      <w:r>
-        <w:t>Для междугороднего автобуса: максимальная скорость, вместимость, р</w:t>
-      </w:r>
-      <w:r>
-        <w:t>есурс, комфорт, расход топлива.</w:t>
-      </w:r>
-    </w:p>
-    <w:p>
-      <w:pPr>
-        <w:ind w:firstLine="709"/>
-        <w:jc w:val="both"/>
-      </w:pPr>
-      <w:r>
-        <w:t>Для автобуса малой вместимости: маневренность, эко</w:t>
-      </w:r>
-      <w:r>
-        <w:t>-класс, ресурс, расход топлива.</w:t>
-      </w:r>
-    </w:p>
-    <w:p>
-      <w:pPr>
-        <w:ind w:firstLine="709"/>
-        <w:jc w:val="both"/>
-      </w:pPr>
-      <w:r>
-        <w:t>Для спецтранспорта (эвакуатора автобусов): грузоподъёмность, скорость эвакуации, маневренность,</w:t>
-      </w:r>
-      <w:r>
-        <w:t xml:space="preserve"> расход топлива.</w:t>
+        <w:t>Для оценки технического уровня выбран метод относительных показателей. Суть метода: каждый показатель качества оцениваемого образца сравнивается с таким же показателем эталонного образца. В результате получается относительное число, показывающее, лучше или хуже образец по данному параметру.</w:t>
+      </w:r>
+    </w:p>
+    <w:p>
+      <w:pPr>
+        <w:ind w:firstLine="709"/>
+        <w:jc w:val="both"/>
+      </w:pPr>
+      <w:r>
+        <w:t>Данный метод является простым, понятным и позволяет сравнивать разные образцы по разно</w:t>
+      </w:r>
+      <w:r>
+        <w:t xml:space="preserve">родным показателям: </w:t>
+      </w:r>
+      <w:r>
+        <w:t>максимальная скорость,</w:t>
+      </w:r>
+      <w:r>
+        <w:t xml:space="preserve"> расход топлива, комфорт и т.д</w:t>
+      </w:r>
+      <w:r>
+        <w:t>. Все показатели приводятся к безразмерному виду, что делает их сопоставимыми между собой.</w:t>
+      </w:r>
+    </w:p>
+    <w:p>
+      <w:pPr>
+        <w:ind w:firstLine="709"/>
+        <w:jc w:val="both"/>
+      </w:pPr>
+      <w:r>
+        <w:t>Для каждого типа подвижного состава выбрано по 4–5 показателей.</w:t>
+      </w:r>
+    </w:p>
+    <w:p>
+      <w:pPr>
+        <w:ind w:firstLine="709"/>
+        <w:jc w:val="both"/>
+      </w:pPr>
+      <w:r>
+        <w:t>Для междугороднего автобуса: максимальная скорость, вместимость, ресурс, комфорт, расход топлива.</w:t>
+      </w:r>
+    </w:p>
+    <w:p>
+      <w:pPr>
+        <w:ind w:firstLine="709"/>
+        <w:jc w:val="both"/>
+      </w:pPr>
+      <w:r>
+        <w:t>Для автобуса малой вместимости: маневренность, эко-класс, ресурс, расход топлива.</w:t>
+      </w:r>
+    </w:p>
+    <w:p>
+      <w:pPr>
+        <w:ind w:firstLine="709"/>
+        <w:jc w:val="both"/>
+      </w:pPr>
+      <w:r>
+        <w:t>Для спецтранспорта (эвакуатора автобусов): грузоподъёмность, скорость эвакуации, маневренность, расход топлива.</w:t>
       </w:r>
     </w:p>
     <w:p>
@@ -2282,52 +3160,37 @@
         <w:jc w:val="both"/>
       </w:pPr>
       <w:r>
-        <w:t>Стимуляторы</w:t>
-      </w:r>
-      <w:r>
-        <w:t>: максимальная скорость, вместимость, ресурс, комфорт, маневренность, эко-класс, грузоп</w:t>
-      </w:r>
-      <w:r>
-        <w:t>одъёмность, скорость эвакуации.</w:t>
-      </w:r>
-    </w:p>
-    <w:p>
-      <w:pPr>
-        <w:ind w:firstLine="709"/>
-        <w:jc w:val="both"/>
-      </w:pPr>
-      <w:r>
-        <w:t>Дестимуляторы</w:t>
-      </w:r>
-      <w:r>
-        <w:t>: расход топлив</w:t>
-      </w:r>
-      <w:r>
-        <w:t>а.</w:t>
-      </w:r>
-    </w:p>
-    <w:p>
-      <w:pPr>
-        <w:ind w:firstLine="709"/>
-        <w:jc w:val="both"/>
-      </w:pPr>
-      <w:r>
-        <w:t xml:space="preserve">Алгоритм </w:t>
-      </w:r>
-      <w:r>
-        <w:t>расчёта комплексного показателя</w:t>
-      </w:r>
-    </w:p>
-    <w:p>
-      <w:pPr>
-        <w:ind w:firstLine="709"/>
-        <w:jc w:val="both"/>
-      </w:pPr>
-      <w:r>
-        <w:t>Для показателей-стимуляторов: относительный показатель = значе</w:t>
-      </w:r>
-      <w:r>
-        <w:t>ние образца / значение эталона.</w:t>
+        <w:t>Стимуляторы: максимальная скорость, вместимость, ресурс, комфорт, маневренность, эко-класс, грузоподъёмность, скорость эвакуации.</w:t>
+      </w:r>
+    </w:p>
+    <w:p>
+      <w:pPr>
+        <w:ind w:firstLine="709"/>
+        <w:jc w:val="both"/>
+      </w:pPr>
+      <w:r>
+        <w:t>Дестимуляторы: расход топлива.</w:t>
+      </w:r>
+    </w:p>
+    <w:p>
+      <w:pPr>
+        <w:ind w:firstLine="709"/>
+        <w:jc w:val="both"/>
+      </w:pPr>
+      <w:r>
+        <w:t>Алгоритм расчёта комплексного показателя</w:t>
+      </w:r>
+      <w:r>
+        <w:t>:</w:t>
+      </w:r>
+    </w:p>
+    <w:p>
+      <w:pPr>
+        <w:ind w:firstLine="709"/>
+        <w:jc w:val="both"/>
+      </w:pPr>
+      <w:r>
+        <w:t>Для показателей-стимуляторов: относительный показатель = значение образца / значение эталона.</w:t>
       </w:r>
     </w:p>
     <w:p>
@@ -2344,22 +3207,16 @@
       </w:r>
       <w:proofErr w:type="spellEnd"/>
       <w:r>
-        <w:t>: относительный показатель = значе</w:t>
-      </w:r>
-      <w:r>
-        <w:t>ние эталона / значение образца.</w:t>
-      </w:r>
-    </w:p>
-    <w:p>
-      <w:pPr>
-        <w:ind w:firstLine="709"/>
-        <w:jc w:val="both"/>
-      </w:pPr>
-      <w:r>
-        <w:t>Если относительный показатель больше 1 — образец лучше эталона по данному параметру. Если меньше 1 — хуже. Если р</w:t>
-      </w:r>
-      <w:r>
-        <w:t>авен 1 — соответствует эталону.</w:t>
+        <w:t>: относительный показатель = значение эталона / значение образца.</w:t>
+      </w:r>
+    </w:p>
+    <w:p>
+      <w:pPr>
+        <w:ind w:firstLine="709"/>
+        <w:jc w:val="both"/>
+      </w:pPr>
+      <w:r>
+        <w:t>Если относительный показатель больше 1 — образец лучше эталона по данному параметру. Если меньше 1 — хуже. Если равен 1 — соответствует эталону.</w:t>
       </w:r>
     </w:p>
     <w:p>
@@ -2369,54 +3226,28 @@
       </w:pPr>
       <w:r>
         <w:lastRenderedPageBreak/>
-        <w:t>В данной реализации коэффициенты весомости приняты равными (равнозначность показателей), так как все выбранные характеристики одинаково важны для оценки технического уровня автобусного парка. При необходимости пользователь мо</w:t>
-      </w:r>
-      <w:r>
-        <w:t>жет изменить веса в настройках.</w:t>
-      </w:r>
-    </w:p>
-    <w:p>
-      <w:pPr>
-        <w:ind w:firstLine="709"/>
-        <w:jc w:val="both"/>
-      </w:pPr>
-      <w:r>
-        <w:t>Интегральный индекс качества рассчитывается как среднее геометрическое всех относительных показателей (для учёта р</w:t>
-      </w:r>
-      <w:r>
-        <w:t>азнородности единиц измерения):</w:t>
-      </w:r>
-    </w:p>
-    <w:p>
-      <w:pPr>
-        <w:ind w:firstLine="709"/>
-        <w:jc w:val="both"/>
-      </w:pPr>
-      <w:r>
-        <w:t>Индекс качества = (произведение всех о</w:t>
-      </w:r>
-      <w:r>
-        <w:t xml:space="preserve">тносительных </w:t>
-      </w:r>
-      <w:proofErr w:type="gramStart"/>
-      <w:r>
-        <w:t>показателей)^</w:t>
-      </w:r>
-      <w:proofErr w:type="gramEnd"/>
-      <w:r>
-        <w:t>(1/n)</w:t>
-      </w:r>
-    </w:p>
-    <w:p>
-      <w:pPr>
-        <w:ind w:firstLine="709"/>
-        <w:jc w:val="both"/>
-      </w:pPr>
-      <w:r>
-        <w:t xml:space="preserve">Чем выше индекс, тем лучше образец. Образец с индексом больше 1 превосходит эталон, </w:t>
-      </w:r>
-      <w:r>
-        <w:t>с индексом меньше 1 — уступает.</w:t>
+        <w:t>В данной реализации коэффициенты весомости приняты равными (равнозначность показателей), так как все выбранные характеристики одинаково важны для оценки технического уровня автобусного парка. При необходимости пользователь может изменить веса в настройках.</w:t>
+      </w:r>
+    </w:p>
+    <w:p>
+      <w:pPr>
+        <w:ind w:firstLine="709"/>
+        <w:jc w:val="both"/>
+      </w:pPr>
+      <w:r>
+        <w:t>Интегральный индекс качества рассчитывается как среднее геометрическое всех относ</w:t>
+      </w:r>
+      <w:r>
+        <w:t>ительных показателей.</w:t>
+      </w:r>
+    </w:p>
+    <w:p>
+      <w:pPr>
+        <w:ind w:firstLine="709"/>
+        <w:jc w:val="both"/>
+      </w:pPr>
+      <w:r>
+        <w:t>Чем выше индекс, тем лучше образец. Образец с индексом больше 1 превосходит эталон, с индексом меньше 1 — уступает.</w:t>
       </w:r>
     </w:p>
     <w:p>
@@ -2434,22 +3265,19 @@
         <w:jc w:val="both"/>
       </w:pPr>
       <w:r>
-        <w:t>П</w:t>
-      </w:r>
-      <w:r>
-        <w:t>осле расчёта программа выводит:</w:t>
-      </w:r>
-    </w:p>
-    <w:p>
-      <w:pPr>
-        <w:ind w:firstLine="709"/>
-        <w:jc w:val="both"/>
-      </w:pPr>
-      <w:r>
-        <w:t>Радиальную (лепестковую) диаграмму, на которой показаны относительные показатели лучшего образца по всем параметрам. Это позволяет увидеть, по каким параметрам обр</w:t>
-      </w:r>
-      <w:r>
-        <w:t>азец силён, а по каким отстаёт.</w:t>
+        <w:t>После расчёта программа выводит:</w:t>
+      </w:r>
+    </w:p>
+    <w:p>
+      <w:pPr>
+        <w:ind w:firstLine="709"/>
+        <w:jc w:val="both"/>
+      </w:pPr>
+      <w:r>
+        <w:t xml:space="preserve">Радиальную </w:t>
+      </w:r>
+      <w:r>
+        <w:t>диаграмму, на которой показаны относительные показатели лучшего образца по всем параметрам. Это позволяет увидеть, по каким параметрам образец силён, а по каким отстаёт.</w:t>
       </w:r>
     </w:p>
     <w:p>
@@ -2471,329 +3299,1426 @@
         <w:pStyle w:val="1"/>
         <w:jc w:val="center"/>
       </w:pPr>
-      <w:bookmarkStart w:id="4" w:name="_Toc229241533"/>
+      <w:bookmarkStart w:id="9" w:name="_Toc229241533"/>
+      <w:bookmarkStart w:id="10" w:name="_Toc229738216"/>
       <w:r>
         <w:lastRenderedPageBreak/>
         <w:t>РЕШЕНИЕ ЗАДАЧИ ПРОГНОЗА ДИНАМИКИ ПОКАЗАТЕЛЕЙ</w:t>
       </w:r>
-      <w:bookmarkEnd w:id="4"/>
+      <w:bookmarkEnd w:id="9"/>
+      <w:bookmarkEnd w:id="10"/>
     </w:p>
     <w:p/>
     <w:p>
       <w:pPr>
-        <w:ind w:firstLine="709"/>
-        <w:jc w:val="both"/>
-      </w:pPr>
-      <w:r>
-        <w:t xml:space="preserve">Прогнозируется дневная выручка от перевозок (тыс. руб.). Это основной финансовый показатель, который нужен руководству для планирования работы автобусного парка и </w:t>
-      </w:r>
-      <w:r>
-        <w:t>оценки эффективности перевозок.</w:t>
-      </w:r>
-    </w:p>
-    <w:p>
-      <w:pPr>
-        <w:ind w:firstLine="709"/>
-        <w:jc w:val="both"/>
-      </w:pPr>
-      <w:r>
-        <w:t>Для построения прогноза нужны исторические данные о работе автобусного парка за прошлые периоды. Минимальное количество записей — 50, но чем больше данных, тем точнее прогноз. Данные загружаются из CSV-файла, содержащего следующие признаки: цена топлива, средняя протяжённость маршрута, наличие праздничного/выходного дня, количество работающих автобусов, погодные условия. Целево</w:t>
-      </w:r>
-      <w:r>
-        <w:t>й показатель — дневная выручка.</w:t>
-      </w:r>
-    </w:p>
-    <w:p>
-      <w:pPr>
-        <w:ind w:firstLine="709"/>
-        <w:jc w:val="both"/>
-      </w:pPr>
-      <w:r>
-        <w:t>В программе реализованы две модели, по</w:t>
-      </w:r>
-      <w:r>
-        <w:t>льзователь может выбрать любую.</w:t>
-      </w:r>
-    </w:p>
-    <w:p>
-      <w:pPr>
-        <w:ind w:firstLine="709"/>
-        <w:jc w:val="both"/>
-      </w:pPr>
-      <w:r>
-        <w:t>Первая модель — линейная регрессия. Эта модель предполагает, что выручка линейно зависит от входных признаков. Программа находит коэффициенты регрессии, которые наиболее точно описывают зависимость выручки от пр</w:t>
-      </w:r>
-      <w:r>
-        <w:t>изнаков на исторических данных.</w:t>
-      </w:r>
-    </w:p>
-    <w:p>
-      <w:pPr>
-        <w:ind w:firstLine="709"/>
-        <w:jc w:val="both"/>
-      </w:pPr>
-      <w:r>
-        <w:t>Вторая модель — полиномиальная регрессия (степень 2). Эта модель позволяет учитывать нелинейные зависимости между признаками и целевым показателем, что может дать более то</w:t>
-      </w:r>
-      <w:r>
-        <w:t>чный прогноз в сложных случаях.</w:t>
-      </w:r>
-    </w:p>
-    <w:p>
-      <w:pPr>
-        <w:ind w:firstLine="709"/>
-        <w:jc w:val="both"/>
-      </w:pPr>
-      <w:r>
-        <w:t>В</w:t>
-      </w:r>
-      <w:r>
-        <w:t xml:space="preserve"> интерфейсе пользователь может: </w:t>
-      </w:r>
-      <w:r>
-        <w:t>выбрать тип модели (линейная</w:t>
-      </w:r>
-      <w:r>
-        <w:t xml:space="preserve"> или полиномиальная регрессия), о</w:t>
-      </w:r>
-      <w:r>
-        <w:t>бучить</w:t>
-      </w:r>
-      <w:r>
-        <w:t xml:space="preserve"> модель на исторических данных, </w:t>
-      </w:r>
-      <w:r>
-        <w:t>ввести значения признаков вручную и пол</w:t>
-      </w:r>
-      <w:r>
-        <w:t>учить точечный прогноз выручки.</w:t>
-      </w:r>
-    </w:p>
-    <w:p>
-      <w:pPr>
-        <w:ind w:firstLine="709"/>
-        <w:jc w:val="both"/>
-      </w:pPr>
-      <w:r>
-        <w:t>Программа вычисляет следующие метрики качества</w:t>
-      </w:r>
-      <w:r>
-        <w:t xml:space="preserve"> модели на исторических данных:</w:t>
-      </w:r>
-    </w:p>
-    <w:p>
-      <w:pPr>
-        <w:ind w:firstLine="709"/>
-        <w:jc w:val="both"/>
-      </w:pPr>
-      <w:r>
-        <w:t>R² (коэффициент детерминации) — показывает, насколько хорошо модель объясняет вариацию целевого показателя. Значение близкое к 1 оз</w:t>
-      </w:r>
-      <w:r>
-        <w:t>начает высокое качество модели.</w:t>
-      </w:r>
-    </w:p>
-    <w:p>
-      <w:pPr>
-        <w:ind w:firstLine="709"/>
+        <w:ind w:firstLine="426"/>
+        <w:jc w:val="both"/>
+      </w:pPr>
+      <w:r>
+        <w:t>2.1. Описание целевого показателя</w:t>
+      </w:r>
+    </w:p>
+    <w:p>
+      <w:pPr>
+        <w:ind w:firstLine="426"/>
+        <w:jc w:val="both"/>
+      </w:pPr>
+      <w:r>
+        <w:t>Целевым показателем в задаче прогнозирования является дневная выручка от перевозок (тыс. руб.). Выручка вычисляется по формуле:</w:t>
+      </w:r>
+    </w:p>
+    <w:p>
+      <w:pPr>
+        <w:ind w:firstLine="426"/>
+        <w:jc w:val="center"/>
+      </w:pPr>
+      <w:r>
+        <w:t>R = P × N × L × k,</w:t>
+      </w:r>
+    </w:p>
+    <w:p>
+      <w:pPr>
+        <w:ind w:firstLine="426"/>
+        <w:jc w:val="both"/>
+      </w:pPr>
+      <w:r>
+        <w:t>где:</w:t>
+      </w:r>
+    </w:p>
+    <w:p>
+      <w:pPr>
+        <w:ind w:firstLine="426"/>
+        <w:jc w:val="both"/>
+      </w:pPr>
+      <w:r>
+        <w:t>P — средняя стоимость билета (руб.),</w:t>
+      </w:r>
+    </w:p>
+    <w:p>
+      <w:pPr>
+        <w:ind w:firstLine="426"/>
+        <w:jc w:val="both"/>
+      </w:pPr>
+      <w:r>
+        <w:t>N — количество пассажиров,</w:t>
+      </w:r>
+    </w:p>
+    <w:p>
+      <w:pPr>
+        <w:ind w:firstLine="426"/>
+        <w:jc w:val="both"/>
+      </w:pPr>
+      <w:r>
+        <w:t>L — количество рейсов,</w:t>
+      </w:r>
+    </w:p>
+    <w:p>
+      <w:pPr>
+        <w:ind w:firstLine="426"/>
+        <w:jc w:val="both"/>
+      </w:pPr>
+      <w:r>
+        <w:t>k — корректирующий коэффициент, учитывающий погодные условия и праздничные дни.</w:t>
+      </w:r>
+    </w:p>
+    <w:p>
+      <w:pPr>
+        <w:ind w:firstLine="426"/>
+        <w:jc w:val="both"/>
+      </w:pPr>
+      <w:r>
+        <w:t>В рамках регрессионной модели зависимость выручки от признаков описывается формулой:</w:t>
+      </w:r>
+    </w:p>
+    <w:p>
+      <w:pPr>
+        <w:ind w:firstLine="426"/>
+        <w:jc w:val="both"/>
+      </w:pPr>
+      <w:r>
+        <w:t>Линейная регрессия:</w:t>
+      </w:r>
+    </w:p>
+    <w:p>
+      <w:pPr>
+        <w:ind w:firstLine="426"/>
+        <w:jc w:val="center"/>
+      </w:pPr>
+      <w:r>
+        <w:t>y = w₀ + w₁×x₁ + w₂×x₂ + w₃×x₃ + w₄×x₄ + w₅×x₅</w:t>
+      </w:r>
+    </w:p>
+    <w:p>
+      <w:pPr>
+        <w:ind w:firstLine="426"/>
+        <w:jc w:val="both"/>
+      </w:pPr>
+      <w:r>
+        <w:t xml:space="preserve">Полиномиальная регрессия со </w:t>
+      </w:r>
+      <w:r>
+        <w:t>степень</w:t>
+      </w:r>
+      <w:r>
+        <w:t>ю 2</w:t>
+      </w:r>
+      <w:bookmarkStart w:id="11" w:name="_GoBack"/>
+      <w:bookmarkEnd w:id="11"/>
+      <w:r>
+        <w:t>:</w:t>
+      </w:r>
+    </w:p>
+    <w:p>
+      <w:pPr>
+        <w:ind w:firstLine="426"/>
+        <w:jc w:val="center"/>
+      </w:pPr>
+      <w:r>
+        <w:rPr>
+          <w:lang w:val="en-US"/>
+        </w:rPr>
+        <w:t>y</w:t>
+      </w:r>
+      <w:r>
+        <w:t xml:space="preserve"> = </w:t>
+      </w:r>
+      <w:r>
+        <w:rPr>
+          <w:lang w:val="en-US"/>
+        </w:rPr>
+        <w:t>w</w:t>
+      </w:r>
+      <w:r>
+        <w:t xml:space="preserve">₀ + </w:t>
+      </w:r>
+      <w:r>
+        <w:t>Σ</w:t>
+      </w:r>
+      <w:proofErr w:type="spellStart"/>
+      <w:r>
+        <w:rPr>
+          <w:lang w:val="en-US"/>
+        </w:rPr>
+        <w:t>w</w:t>
+      </w:r>
+      <w:r>
+        <w:rPr>
+          <w:vertAlign w:val="subscript"/>
+          <w:lang w:val="en-US"/>
+        </w:rPr>
+        <w:t>i</w:t>
+      </w:r>
+      <w:proofErr w:type="spellEnd"/>
+      <w:r>
+        <w:t>×</w:t>
+      </w:r>
+      <w:r>
+        <w:rPr>
+          <w:lang w:val="en-US"/>
+        </w:rPr>
+        <w:t>x</w:t>
+      </w:r>
+      <w:r>
+        <w:rPr>
+          <w:vertAlign w:val="subscript"/>
+          <w:lang w:val="en-US"/>
+        </w:rPr>
+        <w:t>i</w:t>
+      </w:r>
+      <w:r>
+        <w:t xml:space="preserve"> + </w:t>
+      </w:r>
+      <w:r>
+        <w:t>Σ</w:t>
+      </w:r>
+      <w:proofErr w:type="spellStart"/>
+      <w:r>
+        <w:rPr>
+          <w:lang w:val="en-US"/>
+        </w:rPr>
+        <w:t>w</w:t>
+      </w:r>
+      <w:r>
+        <w:rPr>
+          <w:vertAlign w:val="subscript"/>
+          <w:lang w:val="en-US"/>
+        </w:rPr>
+        <w:t>ij</w:t>
+      </w:r>
+      <w:proofErr w:type="spellEnd"/>
+      <w:r>
+        <w:t>×</w:t>
+      </w:r>
+      <w:r>
+        <w:rPr>
+          <w:lang w:val="en-US"/>
+        </w:rPr>
+        <w:t>x</w:t>
+      </w:r>
+      <w:r>
+        <w:rPr>
+          <w:vertAlign w:val="subscript"/>
+          <w:lang w:val="en-US"/>
+        </w:rPr>
+        <w:t>i</w:t>
+      </w:r>
+      <w:r>
+        <w:t>×</w:t>
+      </w:r>
+      <w:proofErr w:type="spellStart"/>
+      <w:r>
+        <w:rPr>
+          <w:lang w:val="en-US"/>
+        </w:rPr>
+        <w:t>x</w:t>
+      </w:r>
+      <w:r>
+        <w:rPr>
+          <w:vertAlign w:val="subscript"/>
+          <w:lang w:val="en-US"/>
+        </w:rPr>
+        <w:t>j</w:t>
+      </w:r>
+      <w:proofErr w:type="spellEnd"/>
+      <w:r>
+        <w:t xml:space="preserve"> + </w:t>
+      </w:r>
+      <w:r>
+        <w:t>Σ</w:t>
+      </w:r>
+      <w:proofErr w:type="spellStart"/>
+      <w:r>
+        <w:rPr>
+          <w:lang w:val="en-US"/>
+        </w:rPr>
+        <w:t>w</w:t>
+      </w:r>
+      <w:r>
+        <w:rPr>
+          <w:vertAlign w:val="subscript"/>
+          <w:lang w:val="en-US"/>
+        </w:rPr>
+        <w:t>ii</w:t>
+      </w:r>
+      <w:proofErr w:type="spellEnd"/>
+      <w:r>
+        <w:t>×</w:t>
+      </w:r>
+      <w:r>
+        <w:rPr>
+          <w:lang w:val="en-US"/>
+        </w:rPr>
+        <w:t>x</w:t>
+      </w:r>
+      <w:r>
+        <w:rPr>
+          <w:vertAlign w:val="subscript"/>
+          <w:lang w:val="en-US"/>
+        </w:rPr>
+        <w:t>i</w:t>
+      </w:r>
+      <w:r>
+        <w:t>²</w:t>
+      </w:r>
+    </w:p>
+    <w:p>
+      <w:pPr>
+        <w:ind w:firstLine="426"/>
+        <w:jc w:val="both"/>
+      </w:pPr>
+      <w:r>
+        <w:t>где:</w:t>
+      </w:r>
+    </w:p>
+    <w:p>
+      <w:pPr>
+        <w:ind w:firstLine="426"/>
+        <w:jc w:val="both"/>
+      </w:pPr>
+      <w:r>
+        <w:t>y — дневная выручка (тыс. руб.)</w:t>
+      </w:r>
+    </w:p>
+    <w:p>
+      <w:pPr>
+        <w:ind w:firstLine="426"/>
+        <w:jc w:val="both"/>
+      </w:pPr>
+      <w:r>
+        <w:t>x₁ — цена топлива (руб./л)</w:t>
+      </w:r>
+    </w:p>
+    <w:p>
+      <w:pPr>
+        <w:ind w:firstLine="426"/>
+        <w:jc w:val="both"/>
+      </w:pPr>
+      <w:r>
+        <w:t>x₂ — средняя протяжённость маршрута (км)</w:t>
+      </w:r>
+    </w:p>
+    <w:p>
+      <w:pPr>
+        <w:ind w:firstLine="426"/>
+        <w:jc w:val="both"/>
+      </w:pPr>
+      <w:r>
+        <w:t>x₃ — праздник/выходной (1 — да, 0 — нет)</w:t>
+      </w:r>
+    </w:p>
+    <w:p>
+      <w:pPr>
+        <w:ind w:firstLine="426"/>
+        <w:jc w:val="both"/>
+      </w:pPr>
+      <w:r>
+        <w:t>x₄ — количество работающих автобусов</w:t>
+      </w:r>
+    </w:p>
+    <w:p>
+      <w:pPr>
+        <w:ind w:firstLine="426"/>
+        <w:jc w:val="both"/>
+      </w:pPr>
+      <w:r>
+        <w:t>x₅ — погодные условия (1 — хорошая, 0 — плохая)</w:t>
+      </w:r>
+    </w:p>
+    <w:p>
+      <w:pPr>
+        <w:ind w:firstLine="426"/>
+        <w:jc w:val="both"/>
+      </w:pPr>
+      <w:r>
+        <w:t>w — коэффициенты модели, определяемые в процессе обучения</w:t>
+      </w:r>
+    </w:p>
+    <w:p>
+      <w:pPr>
+        <w:ind w:firstLine="426"/>
+        <w:jc w:val="both"/>
+      </w:pPr>
+      <w:r>
+        <w:t>2.2. Алгоритм решения задачи</w:t>
+      </w:r>
+    </w:p>
+    <w:p>
+      <w:pPr>
+        <w:ind w:firstLine="426"/>
+        <w:jc w:val="both"/>
+      </w:pPr>
+      <w:r>
+        <w:t>Текст описания:</w:t>
+      </w:r>
+    </w:p>
+    <w:p>
+      <w:pPr>
+        <w:ind w:firstLine="426"/>
+        <w:jc w:val="both"/>
+      </w:pPr>
+      <w:r>
+        <w:t>Шаг 1. Загрузка данных.</w:t>
+      </w:r>
+    </w:p>
+    <w:p>
+      <w:pPr>
+        <w:ind w:firstLine="426"/>
         <w:jc w:val="both"/>
       </w:pPr>
       <w:r>
         <w:lastRenderedPageBreak/>
-        <w:t>MAE (средняя абсолютная ошибка) — показывает среднее отклонени</w:t>
-      </w:r>
-      <w:r>
-        <w:t>е прогноза от факта в тыс. руб.</w:t>
-      </w:r>
-    </w:p>
-    <w:p>
-      <w:pPr>
-        <w:ind w:firstLine="709"/>
-        <w:jc w:val="both"/>
-      </w:pPr>
-      <w:r>
-        <w:t>Чем выше R² и чем ниже MAE, тем точнее модель. Пользователь может попробовать обе модели и выбра</w:t>
-      </w:r>
-      <w:r>
-        <w:t>ть ту, у которой качество выше.</w:t>
-      </w:r>
-    </w:p>
-    <w:p>
-      <w:pPr>
-        <w:ind w:firstLine="709"/>
-        <w:jc w:val="both"/>
-      </w:pPr>
-      <w:r>
-        <w:t>Результаты прогноза</w:t>
-      </w:r>
-    </w:p>
-    <w:p>
-      <w:pPr>
-        <w:ind w:firstLine="709"/>
-        <w:jc w:val="both"/>
-      </w:pPr>
-      <w:r>
-        <w:t>П</w:t>
-      </w:r>
-      <w:r>
-        <w:t>осле расчёта программа выводит:</w:t>
-      </w:r>
-    </w:p>
-    <w:p>
-      <w:pPr>
-        <w:ind w:firstLine="709"/>
-        <w:jc w:val="both"/>
-      </w:pPr>
-      <w:r>
-        <w:t>Линейный график, на котором показана зависимость дневной выручки от выбранного пользователем признака при фиксированных</w:t>
-      </w:r>
-      <w:r>
-        <w:t xml:space="preserve"> значениях остальных признаков.</w:t>
-      </w:r>
-    </w:p>
-    <w:p>
-      <w:pPr>
-        <w:ind w:firstLine="709"/>
-        <w:jc w:val="both"/>
-      </w:pPr>
-      <w:r>
-        <w:t>Метр</w:t>
-      </w:r>
-      <w:r>
-        <w:t>ики качества модели (R² и MAE).</w:t>
-      </w:r>
-    </w:p>
-    <w:p>
-      <w:pPr>
-        <w:ind w:firstLine="709"/>
-        <w:jc w:val="both"/>
-      </w:pPr>
-      <w:r>
-        <w:t>Точечный прогноз выручки при введённых пользователем значениях признаков.</w:t>
+        <w:t>Программа загружает данные из CSV-файла Bus.csv, содержащего 147 записей с 5 пр</w:t>
+      </w:r>
+      <w:r>
+        <w:t>изнаками и целевым показателем.</w:t>
+      </w:r>
+    </w:p>
+    <w:p>
+      <w:pPr>
+        <w:ind w:firstLine="426"/>
+        <w:jc w:val="both"/>
+      </w:pPr>
+      <w:r>
+        <w:t>Шаг 2. Разделение данных.</w:t>
+      </w:r>
+    </w:p>
+    <w:p>
+      <w:pPr>
+        <w:ind w:firstLine="426"/>
+        <w:jc w:val="both"/>
+      </w:pPr>
+      <w:r>
+        <w:t xml:space="preserve">Данные разделяются на обучающую выборку (80% — 117 записей) и тестовую выборку (20% — 30 записей) с использованием функции </w:t>
+      </w:r>
+      <w:proofErr w:type="spellStart"/>
+      <w:r>
+        <w:t>train_test_split</w:t>
+      </w:r>
+      <w:proofErr w:type="spellEnd"/>
+      <w:r>
+        <w:t>. Разделение необходимо для честной оценки качества модели на данных, которые о</w:t>
+      </w:r>
+      <w:r>
+        <w:t>на не видела во время обучения.</w:t>
+      </w:r>
+    </w:p>
+    <w:p>
+      <w:pPr>
+        <w:ind w:firstLine="426"/>
+        <w:jc w:val="both"/>
+      </w:pPr>
+      <w:r>
+        <w:t>Шаг 3. Выбор модели.</w:t>
+      </w:r>
+    </w:p>
+    <w:p>
+      <w:pPr>
+        <w:ind w:firstLine="426"/>
+        <w:jc w:val="both"/>
+      </w:pPr>
+      <w:r>
+        <w:t>Пользователь выбирает тип модели: линейну</w:t>
+      </w:r>
+      <w:r>
+        <w:t>ю или полиномиальную регрессию.</w:t>
+      </w:r>
+    </w:p>
+    <w:p>
+      <w:pPr>
+        <w:ind w:firstLine="426"/>
+        <w:jc w:val="both"/>
+      </w:pPr>
+      <w:r>
+        <w:t>Шаг 4. Обучение модели.</w:t>
+      </w:r>
+    </w:p>
+    <w:p>
+      <w:pPr>
+        <w:ind w:firstLine="426"/>
+        <w:jc w:val="both"/>
+      </w:pPr>
+      <w:r>
+        <w:t xml:space="preserve">Для линейной регрессии: модель </w:t>
+      </w:r>
+      <w:proofErr w:type="spellStart"/>
+      <w:r>
+        <w:t>LinearRegression</w:t>
+      </w:r>
+      <w:proofErr w:type="spellEnd"/>
+      <w:r>
+        <w:t xml:space="preserve"> из библиотеки </w:t>
+      </w:r>
+      <w:proofErr w:type="spellStart"/>
+      <w:r>
+        <w:t>sklearn</w:t>
+      </w:r>
+      <w:proofErr w:type="spellEnd"/>
+      <w:r>
+        <w:t xml:space="preserve"> обучается на обучающей выборк</w:t>
+      </w:r>
+      <w:r>
+        <w:t>е методом наименьших квадратов.</w:t>
+      </w:r>
+    </w:p>
+    <w:p>
+      <w:pPr>
+        <w:ind w:firstLine="426"/>
+        <w:jc w:val="both"/>
+      </w:pPr>
+      <w:r>
+        <w:t>Для полиномиальной регрессии: сначала выполняется нормализация признаков (</w:t>
+      </w:r>
+      <w:proofErr w:type="spellStart"/>
+      <w:r>
+        <w:t>StandardScaler</w:t>
+      </w:r>
+      <w:proofErr w:type="spellEnd"/>
+      <w:r>
+        <w:t>), затем создаются полиномиальные признаки степени 2 (</w:t>
+      </w:r>
+      <w:proofErr w:type="spellStart"/>
+      <w:r>
+        <w:t>PolynomialFeatures</w:t>
+      </w:r>
+      <w:proofErr w:type="spellEnd"/>
+      <w:r>
+        <w:t>), после чего модель обуча</w:t>
+      </w:r>
+      <w:r>
+        <w:t>ется на преобразованных данных.</w:t>
+      </w:r>
+    </w:p>
+    <w:p>
+      <w:pPr>
+        <w:ind w:firstLine="426"/>
+        <w:jc w:val="both"/>
+      </w:pPr>
+      <w:r>
+        <w:t>Шаг 5. Оценка качества.</w:t>
+      </w:r>
+    </w:p>
+    <w:p>
+      <w:pPr>
+        <w:ind w:firstLine="426"/>
+        <w:jc w:val="both"/>
+      </w:pPr>
+      <w:r>
+        <w:t>Модель делает прогнозы на тестово</w:t>
+      </w:r>
+      <w:r>
+        <w:t>й выборке. Вычисляются метрики:</w:t>
+      </w:r>
+    </w:p>
+    <w:p>
+      <w:pPr>
+        <w:ind w:firstLine="426"/>
+        <w:jc w:val="both"/>
+      </w:pPr>
+      <w:r>
+        <w:t>R² (коэффициент детерминации) — доля дисперсии целевой п</w:t>
+      </w:r>
+      <w:r>
+        <w:t>еременной, объяснённая моделью.</w:t>
+      </w:r>
+    </w:p>
+    <w:p>
+      <w:pPr>
+        <w:ind w:firstLine="426"/>
+        <w:jc w:val="both"/>
+      </w:pPr>
+      <w:r>
+        <w:t>MAE (средняя абсолютная ошибка) — средне</w:t>
+      </w:r>
+      <w:r>
+        <w:t>е отклонение прогноза от факта.</w:t>
+      </w:r>
+    </w:p>
+    <w:p>
+      <w:pPr>
+        <w:ind w:firstLine="426"/>
+        <w:jc w:val="both"/>
+      </w:pPr>
+      <w:r>
+        <w:t>Шаг 6. Ручной прогноз.</w:t>
+      </w:r>
+    </w:p>
+    <w:p>
+      <w:pPr>
+        <w:ind w:firstLine="426"/>
+        <w:jc w:val="both"/>
+      </w:pPr>
+      <w:r>
+        <w:t>Пользователь вводит значения признаков, программа возвр</w:t>
+      </w:r>
+      <w:r>
+        <w:t>ащает точечный прогноз выручки.</w:t>
+      </w:r>
+    </w:p>
+    <w:p>
+      <w:pPr>
+        <w:ind w:firstLine="426"/>
+        <w:jc w:val="both"/>
+      </w:pPr>
+      <w:r>
+        <w:t>Шаг 7. Визуализация зависимости.</w:t>
+      </w:r>
+    </w:p>
+    <w:p>
+      <w:pPr>
+        <w:ind w:firstLine="426"/>
+        <w:jc w:val="both"/>
+      </w:pPr>
+      <w:r>
+        <w:t>Пользователь выбирает признак и диапазон значений, программа строит график зависимости выручки от этого признака при фиксированных остальных.</w:t>
+      </w:r>
+    </w:p>
+    <w:p>
+      <w:pPr>
+        <w:jc w:val="center"/>
+      </w:pPr>
+      <w:r>
+        <w:lastRenderedPageBreak/>
+        <w:drawing>
+          <wp:inline distT="0" distB="0" distL="0" distR="0" wp14:anchorId="34A1E0FB" wp14:editId="618A21A2">
+            <wp:extent cx="4179570" cy="5094514"/>
+            <wp:effectExtent l="0" t="0" r="0" b="0"/>
+            <wp:docPr id="1" name="Рисунок 1"/>
+            <wp:cNvGraphicFramePr>
+              <a:graphicFrameLocks xmlns:a="http://schemas.openxmlformats.org/drawingml/2006/main" noChangeAspect="1"/>
+            </wp:cNvGraphicFramePr>
+            <a:graphic xmlns:a="http://schemas.openxmlformats.org/drawingml/2006/main">
+              <a:graphicData uri="http://schemas.openxmlformats.org/drawingml/2006/picture">
+                <pic:pic xmlns:pic="http://schemas.openxmlformats.org/drawingml/2006/picture">
+                  <pic:nvPicPr>
+                    <pic:cNvPr id="1" name=""/>
+                    <pic:cNvPicPr/>
+                  </pic:nvPicPr>
+                  <pic:blipFill>
+                    <a:blip r:embed="rId5"/>
+                    <a:stretch>
+                      <a:fillRect/>
+                    </a:stretch>
+                  </pic:blipFill>
+                  <pic:spPr>
+                    <a:xfrm>
+                      <a:off x="0" y="0"/>
+                      <a:ext cx="4223012" cy="5147466"/>
+                    </a:xfrm>
+                    <a:prstGeom prst="rect">
+                      <a:avLst/>
+                    </a:prstGeom>
+                  </pic:spPr>
+                </pic:pic>
+              </a:graphicData>
+            </a:graphic>
+          </wp:inline>
+        </w:drawing>
+      </w:r>
+    </w:p>
+    <w:p>
+      <w:pPr>
+        <w:jc w:val="center"/>
+        <w:rPr>
+          <w:sz w:val="20"/>
+        </w:rPr>
+      </w:pPr>
+      <w:r>
+        <w:rPr>
+          <w:sz w:val="20"/>
+        </w:rPr>
+        <w:t xml:space="preserve">Рисунок 1 - </w:t>
+      </w:r>
+      <w:r>
+        <w:rPr>
+          <w:sz w:val="20"/>
+        </w:rPr>
+        <w:t>Блок-схема</w:t>
       </w:r>
     </w:p>
     <w:p>
       <w:pPr>
         <w:spacing w:after="160" w:line="278" w:lineRule="auto"/>
-      </w:pPr>
-      <w:r>
+        <w:ind w:firstLine="709"/>
+        <w:jc w:val="both"/>
+      </w:pPr>
+      <w:r>
+        <w:t xml:space="preserve">2.3. Реализация на </w:t>
+      </w:r>
+      <w:proofErr w:type="spellStart"/>
+      <w:r>
+        <w:t>Python</w:t>
+      </w:r>
+      <w:proofErr w:type="spellEnd"/>
+    </w:p>
+    <w:p>
+      <w:pPr>
+        <w:spacing w:after="160" w:line="278" w:lineRule="auto"/>
+        <w:ind w:firstLine="709"/>
+        <w:jc w:val="both"/>
+      </w:pPr>
+      <w:r>
+        <w:t xml:space="preserve">Для реализации задачи прогнозирования создан класс </w:t>
+      </w:r>
+      <w:proofErr w:type="spellStart"/>
+      <w:r>
+        <w:t>RevenueForecast</w:t>
+      </w:r>
+      <w:proofErr w:type="spellEnd"/>
+      <w:r>
+        <w:t xml:space="preserve"> в модуле revenue_forecast.py. К</w:t>
+      </w:r>
+      <w:r>
+        <w:t>ласс содержит следующие методы:</w:t>
+      </w:r>
+    </w:p>
+    <w:p>
+      <w:pPr>
+        <w:spacing w:after="160" w:line="278" w:lineRule="auto"/>
+        <w:ind w:firstLine="709"/>
+        <w:jc w:val="both"/>
+      </w:pPr>
+      <w:r>
+        <w:t>__</w:t>
+      </w:r>
+      <w:proofErr w:type="spellStart"/>
+      <w:r>
+        <w:t>init</w:t>
+      </w:r>
+      <w:proofErr w:type="spellEnd"/>
+      <w:r>
+        <w:t>_</w:t>
+      </w:r>
+      <w:proofErr w:type="gramStart"/>
+      <w:r>
+        <w:t>_(</w:t>
+      </w:r>
+      <w:proofErr w:type="spellStart"/>
+      <w:proofErr w:type="gramEnd"/>
+      <w:r>
+        <w:t>self</w:t>
+      </w:r>
+      <w:proofErr w:type="spellEnd"/>
+      <w:r>
+        <w:t xml:space="preserve">, </w:t>
+      </w:r>
+      <w:proofErr w:type="spellStart"/>
+      <w:r>
+        <w:t>df</w:t>
+      </w:r>
+      <w:proofErr w:type="spellEnd"/>
+      <w:r>
+        <w:t>) — инициализация, разделение данных н</w:t>
+      </w:r>
+      <w:r>
+        <w:t>а обучающую и тестовую выборки.</w:t>
+      </w:r>
+    </w:p>
+    <w:p>
+      <w:pPr>
+        <w:spacing w:after="160" w:line="278" w:lineRule="auto"/>
+        <w:ind w:firstLine="709"/>
+        <w:jc w:val="both"/>
+      </w:pPr>
+      <w:proofErr w:type="spellStart"/>
+      <w:r>
+        <w:t>train_linear</w:t>
+      </w:r>
+      <w:proofErr w:type="spellEnd"/>
+      <w:r>
+        <w:t>(</w:t>
+      </w:r>
+      <w:proofErr w:type="spellStart"/>
+      <w:r>
+        <w:t>self</w:t>
+      </w:r>
+      <w:proofErr w:type="spellEnd"/>
+      <w:r>
+        <w:t xml:space="preserve">) — обучение модели </w:t>
+      </w:r>
+      <w:r>
+        <w:t>линейной регрессии.</w:t>
+      </w:r>
+    </w:p>
+    <w:p>
+      <w:pPr>
+        <w:spacing w:after="160" w:line="278" w:lineRule="auto"/>
+        <w:ind w:firstLine="709"/>
+        <w:jc w:val="both"/>
+      </w:pPr>
+      <w:proofErr w:type="spellStart"/>
+      <w:r>
+        <w:t>train_</w:t>
+      </w:r>
+      <w:proofErr w:type="gramStart"/>
+      <w:r>
+        <w:t>polynomial</w:t>
+      </w:r>
+      <w:proofErr w:type="spellEnd"/>
+      <w:r>
+        <w:t>(</w:t>
+      </w:r>
+      <w:proofErr w:type="spellStart"/>
+      <w:proofErr w:type="gramEnd"/>
+      <w:r>
+        <w:t>self</w:t>
+      </w:r>
+      <w:proofErr w:type="spellEnd"/>
+      <w:r>
+        <w:t>,</w:t>
+      </w:r>
+      <w:r>
+        <w:t xml:space="preserve"> </w:t>
+      </w:r>
+      <w:proofErr w:type="spellStart"/>
+      <w:r>
+        <w:t>degree</w:t>
+      </w:r>
+      <w:proofErr w:type="spellEnd"/>
+      <w:r>
+        <w:t>=2) — обучение модели полиномиал</w:t>
+      </w:r>
+      <w:r>
+        <w:t>ьной регрессии с нормализацией.</w:t>
+      </w:r>
+    </w:p>
+    <w:p>
+      <w:pPr>
+        <w:spacing w:after="160" w:line="278" w:lineRule="auto"/>
+        <w:ind w:firstLine="709"/>
+        <w:jc w:val="both"/>
+      </w:pPr>
+      <w:proofErr w:type="spellStart"/>
+      <w:proofErr w:type="gramStart"/>
+      <w:r>
+        <w:t>predict</w:t>
+      </w:r>
+      <w:proofErr w:type="spellEnd"/>
+      <w:r>
+        <w:t>(</w:t>
+      </w:r>
+      <w:proofErr w:type="spellStart"/>
+      <w:proofErr w:type="gramEnd"/>
+      <w:r>
+        <w:t>self</w:t>
+      </w:r>
+      <w:proofErr w:type="spellEnd"/>
+      <w:r>
+        <w:t xml:space="preserve">, </w:t>
+      </w:r>
+      <w:proofErr w:type="spellStart"/>
+      <w:r>
+        <w:t>features_dict</w:t>
+      </w:r>
+      <w:proofErr w:type="spellEnd"/>
+      <w:r>
+        <w:t>) — точечный п</w:t>
+      </w:r>
+      <w:r>
+        <w:t>рогноз для введённых признаков.</w:t>
+      </w:r>
+    </w:p>
+    <w:p>
+      <w:pPr>
+        <w:spacing w:after="160" w:line="278" w:lineRule="auto"/>
+        <w:ind w:firstLine="709"/>
+        <w:jc w:val="both"/>
+        <w:rPr>
+          <w:lang w:val="en-US"/>
+        </w:rPr>
+      </w:pPr>
+      <w:proofErr w:type="spellStart"/>
+      <w:r>
+        <w:rPr>
+          <w:lang w:val="en-US"/>
+        </w:rPr>
+        <w:t>get_</w:t>
+      </w:r>
+      <w:proofErr w:type="gramStart"/>
+      <w:r>
+        <w:rPr>
+          <w:lang w:val="en-US"/>
+        </w:rPr>
+        <w:t>dependence</w:t>
+      </w:r>
+      <w:proofErr w:type="spellEnd"/>
+      <w:r>
+        <w:rPr>
+          <w:lang w:val="en-US"/>
+        </w:rPr>
+        <w:t>(</w:t>
+      </w:r>
+      <w:proofErr w:type="gramEnd"/>
+      <w:r>
+        <w:rPr>
+          <w:lang w:val="en-US"/>
+        </w:rPr>
+        <w:t xml:space="preserve">self, </w:t>
+      </w:r>
+      <w:proofErr w:type="spellStart"/>
+      <w:r>
+        <w:rPr>
+          <w:lang w:val="en-US"/>
+        </w:rPr>
+        <w:t>fixed_features</w:t>
+      </w:r>
+      <w:proofErr w:type="spellEnd"/>
+      <w:r>
+        <w:rPr>
+          <w:lang w:val="en-US"/>
+        </w:rPr>
+        <w:t xml:space="preserve">, </w:t>
+      </w:r>
+      <w:proofErr w:type="spellStart"/>
+      <w:r>
+        <w:rPr>
+          <w:lang w:val="en-US"/>
+        </w:rPr>
+        <w:t>varying_feature</w:t>
+      </w:r>
+      <w:proofErr w:type="spellEnd"/>
+      <w:r>
+        <w:rPr>
+          <w:lang w:val="en-US"/>
+        </w:rPr>
+        <w:t xml:space="preserve">, </w:t>
+      </w:r>
+      <w:proofErr w:type="spellStart"/>
+      <w:r>
+        <w:rPr>
+          <w:lang w:val="en-US"/>
+        </w:rPr>
+        <w:t>range_values</w:t>
+      </w:r>
+      <w:proofErr w:type="spellEnd"/>
+      <w:r>
+        <w:rPr>
+          <w:lang w:val="en-US"/>
+        </w:rPr>
+        <w:t xml:space="preserve">) — </w:t>
+      </w:r>
+      <w:r>
+        <w:t>получение</w:t>
+      </w:r>
+      <w:r>
+        <w:rPr>
+          <w:lang w:val="en-US"/>
+        </w:rPr>
+        <w:t xml:space="preserve"> </w:t>
+      </w:r>
+      <w:r>
+        <w:t>зависимости</w:t>
+      </w:r>
+      <w:r>
+        <w:rPr>
+          <w:lang w:val="en-US"/>
+        </w:rPr>
+        <w:t xml:space="preserve"> </w:t>
+      </w:r>
+      <w:r>
+        <w:t>выручки</w:t>
+      </w:r>
+      <w:r>
+        <w:rPr>
+          <w:lang w:val="en-US"/>
+        </w:rPr>
+        <w:t xml:space="preserve"> </w:t>
+      </w:r>
+      <w:r>
+        <w:t>от</w:t>
+      </w:r>
+      <w:r>
+        <w:rPr>
+          <w:lang w:val="en-US"/>
+        </w:rPr>
+        <w:t xml:space="preserve"> </w:t>
+      </w:r>
+      <w:r>
+        <w:t>изменяемого</w:t>
+      </w:r>
+      <w:r>
+        <w:rPr>
+          <w:lang w:val="en-US"/>
+        </w:rPr>
+        <w:t xml:space="preserve"> </w:t>
+      </w:r>
+      <w:r>
+        <w:t>признака</w:t>
+      </w:r>
+      <w:r>
+        <w:rPr>
+          <w:lang w:val="en-US"/>
+        </w:rPr>
+        <w:t>.</w:t>
+      </w:r>
+    </w:p>
+    <w:p>
+      <w:pPr>
+        <w:spacing w:after="160" w:line="278" w:lineRule="auto"/>
+        <w:ind w:firstLine="709"/>
+        <w:jc w:val="both"/>
+      </w:pPr>
+      <w:r>
+        <w:t xml:space="preserve">Для визуализации используется библиотека </w:t>
+      </w:r>
+      <w:proofErr w:type="spellStart"/>
+      <w:r>
+        <w:t>Plotly</w:t>
+      </w:r>
+      <w:proofErr w:type="spellEnd"/>
+      <w:r>
+        <w:t xml:space="preserve"> — строятся линейные графики зависимости </w:t>
+      </w:r>
+      <w:r>
+        <w:t>выручки от выбранного признака.</w:t>
+      </w:r>
+    </w:p>
+    <w:p>
+      <w:pPr>
+        <w:spacing w:after="160" w:line="278" w:lineRule="auto"/>
+        <w:ind w:firstLine="709"/>
+        <w:jc w:val="both"/>
+      </w:pPr>
+      <w:r>
+        <w:lastRenderedPageBreak/>
+        <w:t>2.4. Результаты решения</w:t>
+      </w:r>
+    </w:p>
+    <w:p>
+      <w:pPr>
+        <w:spacing w:after="160" w:line="278" w:lineRule="auto"/>
+        <w:ind w:firstLine="709"/>
+        <w:jc w:val="both"/>
+      </w:pPr>
+      <w:r>
+        <w:t>После обучения модел</w:t>
+      </w:r>
+      <w:r>
+        <w:t>ей на данных автобусного парка</w:t>
+      </w:r>
+      <w:r>
+        <w:t xml:space="preserve"> были</w:t>
+      </w:r>
+      <w:r>
+        <w:t xml:space="preserve"> получены следующие результаты:</w:t>
+      </w:r>
+    </w:p>
+    <w:p>
+      <w:pPr>
+        <w:spacing w:after="160" w:line="278" w:lineRule="auto"/>
+        <w:ind w:firstLine="709"/>
+        <w:jc w:val="both"/>
+      </w:pPr>
+      <w:r>
+        <w:t>Линейная регрессия:</w:t>
+      </w:r>
+    </w:p>
+    <w:p>
+      <w:pPr>
+        <w:spacing w:after="160" w:line="278" w:lineRule="auto"/>
+        <w:ind w:firstLine="709"/>
+        <w:jc w:val="both"/>
+      </w:pPr>
+      <w:r>
+        <w:t>R² = 0.</w:t>
+      </w:r>
+      <w:r>
+        <w:t>9</w:t>
+      </w:r>
+      <w:r>
+        <w:t>8</w:t>
+      </w:r>
+    </w:p>
+    <w:p>
+      <w:pPr>
+        <w:spacing w:after="160" w:line="278" w:lineRule="auto"/>
+        <w:ind w:firstLine="709"/>
+        <w:jc w:val="both"/>
+      </w:pPr>
+      <w:r>
+        <w:t xml:space="preserve">MAE = </w:t>
+      </w:r>
+      <w:r>
+        <w:t>13</w:t>
+      </w:r>
+      <w:r>
+        <w:t>.3</w:t>
+      </w:r>
+      <w:r>
+        <w:t>4</w:t>
+      </w:r>
+      <w:r>
+        <w:t xml:space="preserve"> тыс. руб.</w:t>
+      </w:r>
+    </w:p>
+    <w:p>
+      <w:pPr>
+        <w:spacing w:after="160" w:line="278" w:lineRule="auto"/>
+        <w:ind w:firstLine="709"/>
+        <w:jc w:val="both"/>
+      </w:pPr>
+      <w:r>
+        <w:t>Полино</w:t>
+      </w:r>
+      <w:r>
+        <w:t>миальная регрессия</w:t>
+      </w:r>
+      <w:r>
+        <w:t>:</w:t>
+      </w:r>
+    </w:p>
+    <w:p>
+      <w:pPr>
+        <w:spacing w:after="160" w:line="278" w:lineRule="auto"/>
+        <w:ind w:firstLine="709"/>
+        <w:jc w:val="both"/>
+      </w:pPr>
+      <w:r>
+        <w:t>R² = 0.</w:t>
+      </w:r>
+      <w:r>
+        <w:t>9</w:t>
+      </w:r>
+      <w:r>
+        <w:t>7</w:t>
+      </w:r>
+    </w:p>
+    <w:p>
+      <w:pPr>
+        <w:spacing w:after="160" w:line="278" w:lineRule="auto"/>
+        <w:ind w:firstLine="709"/>
+        <w:jc w:val="both"/>
+      </w:pPr>
+      <w:r>
+        <w:t xml:space="preserve">MAE = </w:t>
+      </w:r>
+      <w:r>
+        <w:t>13</w:t>
+      </w:r>
+      <w:r>
+        <w:t>.</w:t>
+      </w:r>
+      <w:r>
+        <w:t>2</w:t>
+      </w:r>
+      <w:r>
+        <w:t xml:space="preserve"> тыс. руб.</w:t>
+      </w:r>
+    </w:p>
+    <w:p>
+      <w:pPr>
+        <w:spacing w:after="160" w:line="278" w:lineRule="auto"/>
+        <w:ind w:firstLine="709"/>
+        <w:jc w:val="both"/>
+      </w:pPr>
+      <w:r>
+        <w:t>Линейная модель показала более высокое качество, что объясняется ограниченным объёмом данных</w:t>
+      </w:r>
+      <w:r>
+        <w:t xml:space="preserve"> и переобучением полиномиальной модели</w:t>
+      </w:r>
+      <w:r>
+        <w:t>.</w:t>
+      </w:r>
+    </w:p>
+    <w:p>
+      <w:pPr>
+        <w:spacing w:after="160" w:line="278" w:lineRule="auto"/>
+        <w:jc w:val="both"/>
+        <w:rPr>
+          <w:noProof/>
+          <w:sz w:val="24"/>
+          <w:lang w:eastAsia="ru-RU"/>
+          <w14:ligatures w14:val="standardContextual"/>
+        </w:rPr>
+      </w:pPr>
+      <w:r>
+        <w:drawing>
+          <wp:inline distT="0" distB="0" distL="0" distR="0" wp14:anchorId="5C5B51F2" wp14:editId="058E493C">
+            <wp:extent cx="5940425" cy="1954530"/>
+            <wp:effectExtent l="0" t="0" r="3175" b="7620"/>
+            <wp:docPr id="2" name="Рисунок 2"/>
+            <wp:cNvGraphicFramePr>
+              <a:graphicFrameLocks xmlns:a="http://schemas.openxmlformats.org/drawingml/2006/main" noChangeAspect="1"/>
+            </wp:cNvGraphicFramePr>
+            <a:graphic xmlns:a="http://schemas.openxmlformats.org/drawingml/2006/main">
+              <a:graphicData uri="http://schemas.openxmlformats.org/drawingml/2006/picture">
+                <pic:pic xmlns:pic="http://schemas.openxmlformats.org/drawingml/2006/picture">
+                  <pic:nvPicPr>
+                    <pic:cNvPr id="1" name=""/>
+                    <pic:cNvPicPr/>
+                  </pic:nvPicPr>
+                  <pic:blipFill>
+                    <a:blip r:embed="rId6"/>
+                    <a:stretch>
+                      <a:fillRect/>
+                    </a:stretch>
+                  </pic:blipFill>
+                  <pic:spPr>
+                    <a:xfrm>
+                      <a:off x="0" y="0"/>
+                      <a:ext cx="5940425" cy="1954530"/>
+                    </a:xfrm>
+                    <a:prstGeom prst="rect">
+                      <a:avLst/>
+                    </a:prstGeom>
+                  </pic:spPr>
+                </pic:pic>
+              </a:graphicData>
+            </a:graphic>
+          </wp:inline>
+        </w:drawing>
+      </w:r>
+      <w:r>
+        <w:rPr>
+          <w:noProof/>
+          <w:lang w:eastAsia="ru-RU"/>
+          <w14:ligatures w14:val="standardContextual"/>
+        </w:rPr>
+        <w:t xml:space="preserve"> </w:t>
+      </w:r>
+    </w:p>
+    <w:p>
+      <w:pPr>
+        <w:spacing w:after="160" w:line="278" w:lineRule="auto"/>
+        <w:jc w:val="center"/>
+        <w:rPr>
+          <w:noProof/>
+          <w:sz w:val="22"/>
+          <w:lang w:eastAsia="ru-RU"/>
+          <w14:ligatures w14:val="standardContextual"/>
+        </w:rPr>
+      </w:pPr>
+      <w:r>
+        <w:rPr>
+          <w:noProof/>
+          <w:sz w:val="22"/>
+          <w:lang w:eastAsia="ru-RU"/>
+          <w14:ligatures w14:val="standardContextual"/>
+        </w:rPr>
+        <w:t>Рисунок 2 – график зависимости дневной выручки от цены топлива (линейная регрессия)</w:t>
+      </w:r>
+    </w:p>
+    <w:p>
+      <w:pPr>
+        <w:spacing w:after="160" w:line="278" w:lineRule="auto"/>
+        <w:jc w:val="both"/>
+      </w:pPr>
+      <w:r>
+        <w:rPr>
+          <w:noProof/>
+          <w:lang w:eastAsia="ru-RU"/>
+          <w14:ligatures w14:val="standardContextual"/>
+        </w:rPr>
+        <w:drawing>
+          <wp:inline distT="0" distB="0" distL="0" distR="0" wp14:anchorId="41CEFCBC" wp14:editId="6E25F326">
+            <wp:extent cx="5940425" cy="1981200"/>
+            <wp:effectExtent l="0" t="0" r="3175" b="0"/>
+            <wp:docPr id="4" name="Рисунок 4"/>
+            <wp:cNvGraphicFramePr>
+              <a:graphicFrameLocks xmlns:a="http://schemas.openxmlformats.org/drawingml/2006/main" noChangeAspect="1"/>
+            </wp:cNvGraphicFramePr>
+            <a:graphic xmlns:a="http://schemas.openxmlformats.org/drawingml/2006/main">
+              <a:graphicData uri="http://schemas.openxmlformats.org/drawingml/2006/picture">
+                <pic:pic xmlns:pic="http://schemas.openxmlformats.org/drawingml/2006/picture">
+                  <pic:nvPicPr>
+                    <pic:cNvPr id="1" name=""/>
+                    <pic:cNvPicPr/>
+                  </pic:nvPicPr>
+                  <pic:blipFill>
+                    <a:blip r:embed="rId7"/>
+                    <a:stretch>
+                      <a:fillRect/>
+                    </a:stretch>
+                  </pic:blipFill>
+                  <pic:spPr>
+                    <a:xfrm>
+                      <a:off x="0" y="0"/>
+                      <a:ext cx="5940425" cy="1981200"/>
+                    </a:xfrm>
+                    <a:prstGeom prst="rect">
+                      <a:avLst/>
+                    </a:prstGeom>
+                  </pic:spPr>
+                </pic:pic>
+              </a:graphicData>
+            </a:graphic>
+          </wp:inline>
+        </w:drawing>
+      </w:r>
+    </w:p>
+    <w:p>
+      <w:pPr>
+        <w:spacing w:after="160" w:line="278" w:lineRule="auto"/>
+        <w:jc w:val="center"/>
+        <w:rPr>
+          <w:noProof/>
+          <w:sz w:val="22"/>
+          <w:lang w:eastAsia="ru-RU"/>
+          <w14:ligatures w14:val="standardContextual"/>
+        </w:rPr>
+      </w:pPr>
+      <w:r>
+        <w:rPr>
+          <w:noProof/>
+          <w:sz w:val="22"/>
+          <w:lang w:eastAsia="ru-RU"/>
+          <w14:ligatures w14:val="standardContextual"/>
+        </w:rPr>
+        <w:t>Рисунок 3</w:t>
+      </w:r>
+      <w:r>
+        <w:rPr>
+          <w:noProof/>
+          <w:sz w:val="22"/>
+          <w:lang w:eastAsia="ru-RU"/>
+          <w14:ligatures w14:val="standardContextual"/>
+        </w:rPr>
+        <w:t xml:space="preserve"> – график зависимости дневной выручки от цены топлива (</w:t>
+      </w:r>
+      <w:r>
+        <w:rPr>
+          <w:noProof/>
+          <w:sz w:val="22"/>
+          <w:lang w:eastAsia="ru-RU"/>
+          <w14:ligatures w14:val="standardContextual"/>
+        </w:rPr>
+        <w:t>полиномиальная</w:t>
+      </w:r>
+      <w:r>
+        <w:rPr>
+          <w:noProof/>
+          <w:sz w:val="22"/>
+          <w:lang w:eastAsia="ru-RU"/>
+          <w14:ligatures w14:val="standardContextual"/>
+        </w:rPr>
+        <w:t xml:space="preserve"> регрессия)</w:t>
+      </w:r>
+    </w:p>
+    <w:p>
+      <w:pPr>
+        <w:spacing w:after="160" w:line="278" w:lineRule="auto"/>
+        <w:jc w:val="both"/>
+        <w:rPr>
+          <w:sz w:val="24"/>
+        </w:rPr>
+      </w:pPr>
+      <w:r>
+        <w:rPr>
+          <w:sz w:val="24"/>
+        </w:rPr>
         <w:br w:type="page"/>
       </w:r>
-      <w:bookmarkStart w:id="5" w:name="_GoBack"/>
-      <w:bookmarkEnd w:id="5"/>
     </w:p>
     <w:p>
       <w:pPr>
         <w:pStyle w:val="1"/>
         <w:jc w:val="center"/>
       </w:pPr>
-      <w:bookmarkStart w:id="6" w:name="_Toc229241534"/>
+      <w:bookmarkStart w:id="12" w:name="_Toc229241534"/>
+      <w:bookmarkStart w:id="13" w:name="_Toc229738217"/>
       <w:r>
         <w:lastRenderedPageBreak/>
         <w:t>РЕШЕНИЕ ЗАДАЧИ ОПТИМИЗАЦИИ ПРОЦЕССА</w:t>
       </w:r>
-      <w:bookmarkEnd w:id="6"/>
-    </w:p>
-    <w:p>
-      <w:pPr>
-        <w:ind w:firstLine="709"/>
-        <w:jc w:val="both"/>
-      </w:pPr>
-    </w:p>
-    <w:p>
-      <w:pPr>
-        <w:ind w:firstLine="709"/>
-        <w:jc w:val="both"/>
-      </w:pPr>
-      <w:r>
-        <w:t>Решается транспортная задача распределения автобусов по маршрутам. Имеется парк автобусов, каждый из которых может выполнить определённое количество рейсов. Имеется несколько маршрутов с заданной потребностью в рейсах. Известна стоимость выполнения одного рейса каждым автобусом на каждом маршруте (учитывает топливо, амортизацию, зарплату водителя). Требуется составить план распределения рейсов так, чтобы все потребности маршрутов были удовлетворены, а общие</w:t>
-      </w:r>
-      <w:r>
-        <w:t xml:space="preserve"> затраты — минимальны.</w:t>
-      </w:r>
-    </w:p>
-    <w:p>
-      <w:pPr>
-        <w:ind w:firstLine="709"/>
-        <w:jc w:val="both"/>
-      </w:pPr>
-      <w:r>
-        <w:t>Для автобусного парка логистика - это значительная статья расходов. Топливо, амортизация и заработная плата водителей составляют основную часть эксплуатационных затрат. Даже небольшое улучшение плана распределения рейсов может сэкономить значительные средства. Транспортная задача — классическая задача оптимизации, для которой существуют гот</w:t>
-      </w:r>
-      <w:r>
-        <w:t>овые и надёжные методы решения.</w:t>
-      </w:r>
-    </w:p>
-    <w:p>
-      <w:pPr>
-        <w:ind w:firstLine="709"/>
-        <w:jc w:val="both"/>
-      </w:pPr>
-      <w:r>
-        <w:t>Для решения задач</w:t>
-      </w:r>
-      <w:r>
-        <w:t>и необходимы три набора данных:</w:t>
-      </w:r>
-    </w:p>
-    <w:p>
-      <w:pPr>
-        <w:ind w:firstLine="709"/>
-        <w:jc w:val="both"/>
-      </w:pPr>
-      <w:r>
-        <w:t xml:space="preserve">Запасы автобусов — сколько рейсов может выполнить каждый автобус (учитывается рабочее </w:t>
-      </w:r>
-      <w:r>
-        <w:t>время и техническое состояние).</w:t>
-      </w:r>
-    </w:p>
-    <w:p>
-      <w:pPr>
-        <w:ind w:firstLine="709"/>
-        <w:jc w:val="both"/>
-      </w:pPr>
-      <w:r>
-        <w:t>Потребности маршрутов — сколько рейсов требуется на каждом маршруте (определяется на основе</w:t>
-      </w:r>
-      <w:r>
-        <w:t xml:space="preserve"> пассажиропотока и расписания).</w:t>
-      </w:r>
-    </w:p>
-    <w:p>
-      <w:pPr>
-        <w:ind w:firstLine="709"/>
-        <w:jc w:val="both"/>
-      </w:pPr>
-      <w:r>
-        <w:t>Матрица стоимости перевозок — стоимость выполнения одного рейса каждым автоб</w:t>
-      </w:r>
-      <w:r>
-        <w:t>усом на каждом маршруте.</w:t>
-      </w:r>
-    </w:p>
-    <w:p>
-      <w:pPr>
-        <w:ind w:firstLine="709"/>
-        <w:jc w:val="both"/>
-      </w:pPr>
-      <w:r>
-        <w:t>Все данные могут быть загружены из CSV-файла или в</w:t>
-      </w:r>
-      <w:r>
-        <w:t>ведены вручную через интерфейс.</w:t>
-      </w:r>
-    </w:p>
-    <w:p>
-      <w:pPr>
-        <w:ind w:firstLine="709"/>
-        <w:jc w:val="both"/>
-      </w:pPr>
-      <w:r>
-        <w:t>Задача называется сбалансированной, если сумма всех запасов (рейсов, которые могут выполнить автобусы) равна сумме всех потребностей (рейсов, необходимых на маршрутах). Если это не так, задача решает</w:t>
-      </w:r>
-      <w:r>
-        <w:t>ся, но требуется корректировка.</w:t>
+      <w:bookmarkEnd w:id="12"/>
+      <w:bookmarkEnd w:id="13"/>
+    </w:p>
+    <w:p>
+      <w:pPr>
+        <w:ind w:firstLine="709"/>
+        <w:jc w:val="both"/>
+      </w:pPr>
+    </w:p>
+    <w:p>
+      <w:pPr>
+        <w:ind w:firstLine="709"/>
+        <w:jc w:val="both"/>
+      </w:pPr>
+      <w:r>
+        <w:t>Решается транспортная задача распределения автобусов по маршрутам. Имеется парк автобусов, каждый из которых может выполнить определённое количество рейсов. Имеется несколько маршрутов с заданной потребностью в рейсах. Известна стоимость выполнения одного рейса каждым автобусом на каждом маршруте (учитывает топливо, амортизацию, зарплату водителя). Требуется составить план распределения рейсов так, чтобы все потребности маршрутов были удовлетворены, а общие затраты — минимальны.</w:t>
+      </w:r>
+    </w:p>
+    <w:p>
+      <w:pPr>
+        <w:ind w:firstLine="709"/>
+        <w:jc w:val="both"/>
+      </w:pPr>
+      <w:r>
+        <w:t>Для автобусного парка логистика - это значительная статья расходов. Топливо, амортизация и заработная плата водителей составляют основную часть эксплуатационных затрат. Даже небольшое улучшение плана распределения рейсов может сэкономить значительные средства. Транспортная задача — классическая задача оптимизации, для которой существуют готовые и надёжные методы решения.</w:t>
+      </w:r>
+    </w:p>
+    <w:p>
+      <w:pPr>
+        <w:ind w:firstLine="709"/>
+        <w:jc w:val="both"/>
+      </w:pPr>
+      <w:r>
+        <w:t>Для решения задачи необходимы три набора данных:</w:t>
+      </w:r>
+    </w:p>
+    <w:p>
+      <w:pPr>
+        <w:ind w:firstLine="709"/>
+        <w:jc w:val="both"/>
+      </w:pPr>
+      <w:r>
+        <w:t>Запасы автобусов — сколько рейсов может выполнить каждый автобус (учитывается рабочее время и техническое состояние).</w:t>
+      </w:r>
+    </w:p>
+    <w:p>
+      <w:pPr>
+        <w:ind w:firstLine="709"/>
+        <w:jc w:val="both"/>
+      </w:pPr>
+      <w:r>
+        <w:t>Потребности маршрутов — сколько рейсов требуется на каждом маршруте (определяется на основе пассажиропотока и расписания).</w:t>
+      </w:r>
+    </w:p>
+    <w:p>
+      <w:pPr>
+        <w:ind w:firstLine="709"/>
+        <w:jc w:val="both"/>
+      </w:pPr>
+      <w:r>
+        <w:t>Матрица стоимости перевозок — стоимость выполнения одного рейса каждым автобусом на каждом маршруте.</w:t>
+      </w:r>
+    </w:p>
+    <w:p>
+      <w:pPr>
+        <w:ind w:firstLine="709"/>
+        <w:jc w:val="both"/>
+      </w:pPr>
+      <w:r>
+        <w:t>Все данные могут быть загружены из CSV-файла или введены вручную через интерфейс.</w:t>
+      </w:r>
+    </w:p>
+    <w:p>
+      <w:pPr>
+        <w:ind w:firstLine="709"/>
+        <w:jc w:val="both"/>
+      </w:pPr>
+      <w:r>
+        <w:t>Задача называется сбалансированной, если сумма всех запасов (рейсов, которые могут выполнить автобусы) равна сумме всех потребностей (рейсов, необходимых на маршрутах). Если это не так, задача решается, но требуется корректировка.</w:t>
       </w:r>
     </w:p>
     <w:p>
@@ -2803,34 +4728,25 @@
       </w:pPr>
       <w:r>
         <w:lastRenderedPageBreak/>
-        <w:t>Если запасов больше, чем потребностей, добавляется фиктивный маршрут, которому нужно «отвезти» лишние рейсы, но стоимость выполнения рейса на фиктивном маршруте равна нулю</w:t>
-      </w:r>
-      <w:r>
-        <w:t>.</w:t>
-      </w:r>
-    </w:p>
-    <w:p>
-      <w:pPr>
-        <w:ind w:firstLine="709"/>
-        <w:jc w:val="both"/>
-      </w:pPr>
-      <w:r>
-        <w:t>Если потребностей больше, чем запасов, добавляется фиктивный автобус, у которого есть недостающие рейсы, но стоим</w:t>
-      </w:r>
-      <w:r>
-        <w:t>ость его работы тоже равна нулю.</w:t>
-      </w:r>
-    </w:p>
-    <w:p>
-      <w:pPr>
-        <w:ind w:firstLine="709"/>
-        <w:jc w:val="both"/>
-      </w:pPr>
-      <w:r>
-        <w:t>Программа делает это автоматически, пользовате</w:t>
-      </w:r>
-      <w:r>
-        <w:t>лю не нужно ничего настраивать.</w:t>
+        <w:t>Если запасов больше, чем потребностей, добавляется фиктивный маршрут, которому нужно «отвезти» лишние рейсы, но стоимость выполнения рейса на фиктивном маршруте равна нулю.</w:t>
+      </w:r>
+    </w:p>
+    <w:p>
+      <w:pPr>
+        <w:ind w:firstLine="709"/>
+        <w:jc w:val="both"/>
+      </w:pPr>
+      <w:r>
+        <w:t>Если потребностей больше, чем запасов, добавляется фиктивный автобус, у которого есть недостающие рейсы, но стоимость его работы тоже равна нулю.</w:t>
+      </w:r>
+    </w:p>
+    <w:p>
+      <w:pPr>
+        <w:ind w:firstLine="709"/>
+        <w:jc w:val="both"/>
+      </w:pPr>
+      <w:r>
+        <w:t>Программа делает это автоматически, пользователю не нужно ничего настраивать.</w:t>
       </w:r>
     </w:p>
     <w:p>
@@ -2847,10 +4763,7 @@
       </w:r>
       <w:proofErr w:type="spellEnd"/>
       <w:r>
-        <w:t xml:space="preserve"> он реализован в библ</w:t>
-      </w:r>
-      <w:r>
-        <w:t xml:space="preserve">иотеке </w:t>
+        <w:t xml:space="preserve"> он реализован в библиотеке </w:t>
       </w:r>
       <w:proofErr w:type="spellStart"/>
       <w:r>
@@ -2875,22 +4788,16 @@
         <w:jc w:val="both"/>
       </w:pPr>
       <w:r>
-        <w:t>Программа формирует задачу в математическом виде: переменные (сколько рейсов выполнит каждый автобус на каждом маршруте), целевую функцию (общая стоимость всех рейсов, которую нужно минимизировать) и ограничения (распределить все рейсы автобусов, удовлетворить все потребности маршрутов, коли</w:t>
-      </w:r>
-      <w:r>
-        <w:t>чество рейсов неотрицательное).</w:t>
-      </w:r>
-    </w:p>
-    <w:p>
-      <w:pPr>
-        <w:ind w:firstLine="709"/>
-        <w:jc w:val="both"/>
-      </w:pPr>
-      <w:r>
-        <w:t>Затем вызывается симплекс-метод, который находит оп</w:t>
-      </w:r>
-      <w:r>
-        <w:t>тимальное решение.</w:t>
+        <w:t>Программа формирует задачу в математическом виде: переменные (сколько рейсов выполнит каждый автобус на каждом маршруте), целевую функцию (общая стоимость всех рейсов, которую нужно минимизировать) и ограничения (распределить все рейсы автобусов, удовлетворить все потребности маршрутов, количество рейсов неотрицательное).</w:t>
+      </w:r>
+    </w:p>
+    <w:p>
+      <w:pPr>
+        <w:ind w:firstLine="709"/>
+        <w:jc w:val="both"/>
+      </w:pPr>
+      <w:r>
+        <w:t>Затем вызывается симплекс-метод, который находит оптимальное решение.</w:t>
       </w:r>
     </w:p>
     <w:p>
@@ -2922,14 +4829,375 @@
         <w:pStyle w:val="1"/>
         <w:jc w:val="center"/>
       </w:pPr>
-      <w:bookmarkStart w:id="7" w:name="_Toc229241535"/>
+      <w:bookmarkStart w:id="14" w:name="_Toc229241535"/>
+      <w:bookmarkStart w:id="15" w:name="_Toc229738218"/>
       <w:r>
         <w:lastRenderedPageBreak/>
         <w:t>ВИЗУАЛИЗАЦИЯ ДАННЫХ</w:t>
       </w:r>
-      <w:bookmarkEnd w:id="7"/>
-    </w:p>
-    <w:p>
+      <w:bookmarkEnd w:id="14"/>
+      <w:bookmarkEnd w:id="15"/>
+    </w:p>
+    <w:p/>
+    <w:p>
+      <w:pPr>
+        <w:ind w:firstLine="709"/>
+        <w:jc w:val="both"/>
+      </w:pPr>
+      <w:r>
+        <w:t>Для визуализации результатов работы всех трёх модулей используется биб</w:t>
+      </w:r>
+      <w:r>
+        <w:t xml:space="preserve">лиотека </w:t>
+      </w:r>
+      <w:proofErr w:type="spellStart"/>
+      <w:r>
+        <w:t>Plotly</w:t>
+      </w:r>
+      <w:proofErr w:type="spellEnd"/>
+      <w:r>
+        <w:t xml:space="preserve"> в связке с </w:t>
+      </w:r>
+      <w:proofErr w:type="spellStart"/>
+      <w:r>
+        <w:t>Dash</w:t>
+      </w:r>
+      <w:proofErr w:type="spellEnd"/>
+      <w:r>
+        <w:t>.</w:t>
+      </w:r>
+    </w:p>
+    <w:p>
+      <w:pPr>
+        <w:ind w:firstLine="709"/>
+        <w:jc w:val="both"/>
+      </w:pPr>
+      <w:r>
+        <w:t>Модуль оценки качества:</w:t>
+      </w:r>
+    </w:p>
+    <w:p>
+      <w:pPr>
+        <w:ind w:firstLine="709"/>
+        <w:jc w:val="both"/>
+      </w:pPr>
+      <w:r>
+        <w:t>Радиальная диаграмма — отображает нормированные показатели лучшего образца. На одном графике собраны все характеристики, что позволяет визуаль</w:t>
+      </w:r>
+      <w:r>
+        <w:t>но сравнить образец с эталоном.</w:t>
+      </w:r>
+    </w:p>
+    <w:p>
+      <w:pPr>
+        <w:jc w:val="both"/>
+      </w:pPr>
+      <w:r>
+        <w:drawing>
+          <wp:inline distT="0" distB="0" distL="0" distR="0" wp14:anchorId="4385C815" wp14:editId="4B9811F2">
+            <wp:extent cx="6068377" cy="2340428"/>
+            <wp:effectExtent l="0" t="0" r="0" b="3175"/>
+            <wp:docPr id="5" name="Рисунок 5"/>
+            <wp:cNvGraphicFramePr>
+              <a:graphicFrameLocks xmlns:a="http://schemas.openxmlformats.org/drawingml/2006/main" noChangeAspect="1"/>
+            </wp:cNvGraphicFramePr>
+            <a:graphic xmlns:a="http://schemas.openxmlformats.org/drawingml/2006/main">
+              <a:graphicData uri="http://schemas.openxmlformats.org/drawingml/2006/picture">
+                <pic:pic xmlns:pic="http://schemas.openxmlformats.org/drawingml/2006/picture">
+                  <pic:nvPicPr>
+                    <pic:cNvPr id="1" name=""/>
+                    <pic:cNvPicPr/>
+                  </pic:nvPicPr>
+                  <pic:blipFill>
+                    <a:blip r:embed="rId8"/>
+                    <a:stretch>
+                      <a:fillRect/>
+                    </a:stretch>
+                  </pic:blipFill>
+                  <pic:spPr>
+                    <a:xfrm>
+                      <a:off x="0" y="0"/>
+                      <a:ext cx="6089362" cy="2348522"/>
+                    </a:xfrm>
+                    <a:prstGeom prst="rect">
+                      <a:avLst/>
+                    </a:prstGeom>
+                  </pic:spPr>
+                </pic:pic>
+              </a:graphicData>
+            </a:graphic>
+          </wp:inline>
+        </w:drawing>
+      </w:r>
+    </w:p>
+    <w:p>
+      <w:pPr>
+        <w:jc w:val="center"/>
+        <w:rPr>
+          <w:sz w:val="22"/>
+        </w:rPr>
+      </w:pPr>
+      <w:r>
+        <w:rPr>
+          <w:sz w:val="22"/>
+        </w:rPr>
+        <w:t>Рисунок 4 – Радиальная диаграмма</w:t>
+      </w:r>
+    </w:p>
+    <w:p>
+      <w:pPr>
+        <w:ind w:firstLine="709"/>
+        <w:jc w:val="both"/>
+      </w:pPr>
+      <w:r>
+        <w:t xml:space="preserve">Столбчатая диаграмма — показывает технический уровень всех автобусов в процентах, отсортированных по убыванию. Лучший </w:t>
+      </w:r>
+      <w:r>
+        <w:t>образец выделен зелёным цветом.</w:t>
+      </w:r>
+    </w:p>
+    <w:p>
+      <w:pPr>
+        <w:jc w:val="both"/>
+      </w:pPr>
+      <w:r>
+        <w:drawing>
+          <wp:inline distT="0" distB="0" distL="0" distR="0" wp14:anchorId="6129FEE6" wp14:editId="206A1893">
+            <wp:extent cx="5940425" cy="2139950"/>
+            <wp:effectExtent l="0" t="0" r="3175" b="0"/>
+            <wp:docPr id="6" name="Рисунок 6"/>
+            <wp:cNvGraphicFramePr>
+              <a:graphicFrameLocks xmlns:a="http://schemas.openxmlformats.org/drawingml/2006/main" noChangeAspect="1"/>
+            </wp:cNvGraphicFramePr>
+            <a:graphic xmlns:a="http://schemas.openxmlformats.org/drawingml/2006/main">
+              <a:graphicData uri="http://schemas.openxmlformats.org/drawingml/2006/picture">
+                <pic:pic xmlns:pic="http://schemas.openxmlformats.org/drawingml/2006/picture">
+                  <pic:nvPicPr>
+                    <pic:cNvPr id="1" name=""/>
+                    <pic:cNvPicPr/>
+                  </pic:nvPicPr>
+                  <pic:blipFill>
+                    <a:blip r:embed="rId9"/>
+                    <a:stretch>
+                      <a:fillRect/>
+                    </a:stretch>
+                  </pic:blipFill>
+                  <pic:spPr>
+                    <a:xfrm>
+                      <a:off x="0" y="0"/>
+                      <a:ext cx="5940425" cy="2139950"/>
+                    </a:xfrm>
+                    <a:prstGeom prst="rect">
+                      <a:avLst/>
+                    </a:prstGeom>
+                  </pic:spPr>
+                </pic:pic>
+              </a:graphicData>
+            </a:graphic>
+          </wp:inline>
+        </w:drawing>
+      </w:r>
+    </w:p>
+    <w:p>
+      <w:pPr>
+        <w:jc w:val="center"/>
+        <w:rPr>
+          <w:sz w:val="20"/>
+        </w:rPr>
+      </w:pPr>
+      <w:r>
+        <w:rPr>
+          <w:sz w:val="20"/>
+        </w:rPr>
+        <w:t>Рисунок 5</w:t>
+      </w:r>
+      <w:r>
+        <w:rPr>
+          <w:sz w:val="20"/>
+        </w:rPr>
+        <w:t xml:space="preserve"> –</w:t>
+      </w:r>
+      <w:r>
+        <w:rPr>
+          <w:sz w:val="20"/>
+        </w:rPr>
+        <w:t xml:space="preserve"> Столбчатая</w:t>
+      </w:r>
+      <w:r>
+        <w:rPr>
+          <w:sz w:val="20"/>
+        </w:rPr>
+        <w:t xml:space="preserve"> диаграмма</w:t>
+      </w:r>
+    </w:p>
+    <w:p>
+      <w:pPr>
+        <w:jc w:val="both"/>
+      </w:pPr>
+    </w:p>
+    <w:p>
+      <w:pPr>
+        <w:jc w:val="both"/>
+      </w:pPr>
+    </w:p>
+    <w:p>
+      <w:pPr>
+        <w:ind w:firstLine="709"/>
+        <w:jc w:val="both"/>
+      </w:pPr>
+      <w:r>
+        <w:lastRenderedPageBreak/>
+        <w:t>Модуль прогнозирования:</w:t>
+      </w:r>
+    </w:p>
+    <w:p>
+      <w:pPr>
+        <w:ind w:firstLine="709"/>
+        <w:jc w:val="both"/>
+      </w:pPr>
+      <w:r>
+        <w:t xml:space="preserve">Линейные графики — отображают зависимость дневной </w:t>
+      </w:r>
+      <w:r>
+        <w:t xml:space="preserve">выручки от выбранного признака: </w:t>
+      </w:r>
+      <w:r>
+        <w:t>цена топлива, протяжённость</w:t>
+      </w:r>
+      <w:r>
+        <w:t xml:space="preserve"> маршрута, количество автобусов</w:t>
+      </w:r>
+      <w:r>
+        <w:t>. График строится при фиксированных</w:t>
+      </w:r>
+      <w:r>
+        <w:t xml:space="preserve"> значениях остальных признаков.</w:t>
+      </w:r>
+    </w:p>
+    <w:p>
+      <w:pPr>
+        <w:jc w:val="both"/>
+      </w:pPr>
+      <w:r>
+        <w:drawing>
+          <wp:inline distT="0" distB="0" distL="0" distR="0" wp14:anchorId="5A0E040D" wp14:editId="45597B35">
+            <wp:extent cx="5940425" cy="2056130"/>
+            <wp:effectExtent l="0" t="0" r="3175" b="1270"/>
+            <wp:docPr id="7" name="Рисунок 7"/>
+            <wp:cNvGraphicFramePr>
+              <a:graphicFrameLocks xmlns:a="http://schemas.openxmlformats.org/drawingml/2006/main" noChangeAspect="1"/>
+            </wp:cNvGraphicFramePr>
+            <a:graphic xmlns:a="http://schemas.openxmlformats.org/drawingml/2006/main">
+              <a:graphicData uri="http://schemas.openxmlformats.org/drawingml/2006/picture">
+                <pic:pic xmlns:pic="http://schemas.openxmlformats.org/drawingml/2006/picture">
+                  <pic:nvPicPr>
+                    <pic:cNvPr id="1" name=""/>
+                    <pic:cNvPicPr/>
+                  </pic:nvPicPr>
+                  <pic:blipFill>
+                    <a:blip r:embed="rId10"/>
+                    <a:stretch>
+                      <a:fillRect/>
+                    </a:stretch>
+                  </pic:blipFill>
+                  <pic:spPr>
+                    <a:xfrm>
+                      <a:off x="0" y="0"/>
+                      <a:ext cx="5940425" cy="2056130"/>
+                    </a:xfrm>
+                    <a:prstGeom prst="rect">
+                      <a:avLst/>
+                    </a:prstGeom>
+                  </pic:spPr>
+                </pic:pic>
+              </a:graphicData>
+            </a:graphic>
+          </wp:inline>
+        </w:drawing>
+      </w:r>
+    </w:p>
+    <w:p>
+      <w:pPr>
+        <w:jc w:val="center"/>
+      </w:pPr>
+      <w:r>
+        <w:rPr>
+          <w:sz w:val="20"/>
+        </w:rPr>
+        <w:t>Рисунок 6 – Линейный график</w:t>
+      </w:r>
+    </w:p>
+    <w:p>
+      <w:pPr>
+        <w:ind w:firstLine="709"/>
+        <w:jc w:val="both"/>
+      </w:pPr>
+      <w:r>
+        <w:t>Модуль оптимизации:</w:t>
+      </w:r>
+    </w:p>
+    <w:p>
+      <w:pPr>
+        <w:ind w:firstLine="709"/>
+        <w:jc w:val="both"/>
+      </w:pPr>
+      <w:r>
+        <w:t>Таблица — отображает оптимальное распределение рейсов между автобусами и маршрутами. Нулевые значения означают, что рейс по данному маршруту не выполняется.</w:t>
+      </w:r>
+    </w:p>
+    <w:p>
+      <w:pPr>
+        <w:spacing w:after="160" w:line="278" w:lineRule="auto"/>
+      </w:pPr>
+      <w:r>
+        <w:drawing>
+          <wp:inline distT="0" distB="0" distL="0" distR="0" wp14:anchorId="3D4508A8" wp14:editId="2AD680CC">
+            <wp:extent cx="5940425" cy="1383665"/>
+            <wp:effectExtent l="0" t="0" r="3175" b="6985"/>
+            <wp:docPr id="8" name="Рисунок 8"/>
+            <wp:cNvGraphicFramePr>
+              <a:graphicFrameLocks xmlns:a="http://schemas.openxmlformats.org/drawingml/2006/main" noChangeAspect="1"/>
+            </wp:cNvGraphicFramePr>
+            <a:graphic xmlns:a="http://schemas.openxmlformats.org/drawingml/2006/main">
+              <a:graphicData uri="http://schemas.openxmlformats.org/drawingml/2006/picture">
+                <pic:pic xmlns:pic="http://schemas.openxmlformats.org/drawingml/2006/picture">
+                  <pic:nvPicPr>
+                    <pic:cNvPr id="1" name=""/>
+                    <pic:cNvPicPr/>
+                  </pic:nvPicPr>
+                  <pic:blipFill>
+                    <a:blip r:embed="rId11"/>
+                    <a:stretch>
+                      <a:fillRect/>
+                    </a:stretch>
+                  </pic:blipFill>
+                  <pic:spPr>
+                    <a:xfrm>
+                      <a:off x="0" y="0"/>
+                      <a:ext cx="5940425" cy="1383665"/>
+                    </a:xfrm>
+                    <a:prstGeom prst="rect">
+                      <a:avLst/>
+                    </a:prstGeom>
+                  </pic:spPr>
+                </pic:pic>
+              </a:graphicData>
+            </a:graphic>
+          </wp:inline>
+        </w:drawing>
+      </w:r>
+    </w:p>
+    <w:p>
+      <w:pPr>
+        <w:spacing w:after="160" w:line="278" w:lineRule="auto"/>
+        <w:jc w:val="center"/>
+      </w:pPr>
+      <w:r>
+        <w:rPr>
+          <w:sz w:val="20"/>
+        </w:rPr>
+        <w:t>Рисунок 7 – Таблица оптимизации</w:t>
+      </w:r>
       <w:r>
         <w:br w:type="page"/>
       </w:r>
@@ -2939,16 +5207,257 @@
         <w:pStyle w:val="1"/>
         <w:jc w:val="center"/>
       </w:pPr>
-      <w:bookmarkStart w:id="8" w:name="_Toc229241536"/>
+      <w:bookmarkStart w:id="16" w:name="_Toc229241536"/>
+      <w:bookmarkStart w:id="17" w:name="_Toc229738219"/>
       <w:r>
         <w:lastRenderedPageBreak/>
         <w:t>ИНСТРУКЦИЯ ПОЛЬЗОВАТЕЛЯ ПО ЭКСПЛУАТАЦИИ ПРОГРАММНОГО ПРОДУКТА</w:t>
       </w:r>
-      <w:bookmarkEnd w:id="8"/>
-    </w:p>
-    <w:p>
-      <w:r>
-        <w:br w:type="page"/>
+      <w:bookmarkEnd w:id="16"/>
+      <w:bookmarkEnd w:id="17"/>
+    </w:p>
+    <w:p/>
+    <w:p>
+      <w:pPr>
+        <w:ind w:firstLine="709"/>
+        <w:jc w:val="both"/>
+      </w:pPr>
+      <w:r>
+        <w:t>Запуск прогр</w:t>
+      </w:r>
+      <w:r>
+        <w:t>аммы</w:t>
+      </w:r>
+    </w:p>
+    <w:p>
+      <w:pPr>
+        <w:ind w:firstLine="709"/>
+        <w:jc w:val="both"/>
+      </w:pPr>
+      <w:r>
+        <w:t xml:space="preserve">Установите необходимые библиотеки: </w:t>
+      </w:r>
+      <w:proofErr w:type="spellStart"/>
+      <w:r>
+        <w:t>pip</w:t>
+      </w:r>
+      <w:proofErr w:type="spellEnd"/>
+      <w:r>
+        <w:t xml:space="preserve"> </w:t>
+      </w:r>
+      <w:proofErr w:type="spellStart"/>
+      <w:r>
+        <w:t>install</w:t>
+      </w:r>
+      <w:proofErr w:type="spellEnd"/>
+      <w:r>
+        <w:t xml:space="preserve"> -r requirements.txt</w:t>
+      </w:r>
+    </w:p>
+    <w:p>
+      <w:pPr>
+        <w:ind w:firstLine="709"/>
+        <w:jc w:val="both"/>
+      </w:pPr>
+      <w:r>
+        <w:t>Запу</w:t>
+      </w:r>
+      <w:r>
+        <w:t xml:space="preserve">стите программу: </w:t>
+      </w:r>
+      <w:proofErr w:type="spellStart"/>
+      <w:r>
+        <w:t>python</w:t>
+      </w:r>
+      <w:proofErr w:type="spellEnd"/>
+      <w:r>
+        <w:t xml:space="preserve"> main.py</w:t>
+      </w:r>
+    </w:p>
+    <w:p>
+      <w:pPr>
+        <w:ind w:firstLine="709"/>
+        <w:jc w:val="both"/>
+      </w:pPr>
+      <w:r>
+        <w:t>Откройте браузер и перейдите п</w:t>
+      </w:r>
+      <w:r>
+        <w:t>о адресу: http://localhost:8050</w:t>
+      </w:r>
+    </w:p>
+    <w:p>
+      <w:pPr>
+        <w:ind w:firstLine="709"/>
+        <w:jc w:val="both"/>
+      </w:pPr>
+      <w:r>
+        <w:t>Вклад</w:t>
+      </w:r>
+      <w:r>
+        <w:t>ка «Оценка технического уровня»</w:t>
+      </w:r>
+    </w:p>
+    <w:p>
+      <w:pPr>
+        <w:ind w:firstLine="709"/>
+        <w:jc w:val="both"/>
+      </w:pPr>
+      <w:r>
+        <w:t>Выберите тип автобуса из выпадающего списка: междугородние, малой</w:t>
+      </w:r>
+      <w:r>
+        <w:t xml:space="preserve"> вместимости или спецтранспорт.</w:t>
+      </w:r>
+    </w:p>
+    <w:p>
+      <w:pPr>
+        <w:ind w:firstLine="709"/>
+        <w:jc w:val="both"/>
+      </w:pPr>
+      <w:r>
+        <w:t>Нажмите кнопку «Р</w:t>
+      </w:r>
+      <w:r>
+        <w:t>ассчитать технический уровень».</w:t>
+      </w:r>
+    </w:p>
+    <w:p>
+      <w:pPr>
+        <w:ind w:firstLine="709"/>
+        <w:jc w:val="both"/>
+      </w:pPr>
+      <w:r>
+        <w:t>На радиальной диаграмме отобразятся нормирован</w:t>
+      </w:r>
+      <w:r>
+        <w:t>ные показатели лучшего образца.</w:t>
+      </w:r>
+    </w:p>
+    <w:p>
+      <w:pPr>
+        <w:ind w:firstLine="709"/>
+        <w:jc w:val="both"/>
+      </w:pPr>
+      <w:r>
+        <w:t>На столбчатой диаграмме — рей</w:t>
+      </w:r>
+      <w:r>
+        <w:t>тинг всех образцов в процентах.</w:t>
+      </w:r>
+    </w:p>
+    <w:p>
+      <w:pPr>
+        <w:ind w:firstLine="709"/>
+        <w:jc w:val="both"/>
+      </w:pPr>
+      <w:r>
+        <w:t>Вкладка «Пр</w:t>
+      </w:r>
+      <w:r>
+        <w:t>огноз дневной выручки»</w:t>
+      </w:r>
+    </w:p>
+    <w:p>
+      <w:pPr>
+        <w:ind w:firstLine="709"/>
+        <w:jc w:val="both"/>
+      </w:pPr>
+      <w:r>
+        <w:t>Выберите тип модели: линейна</w:t>
+      </w:r>
+      <w:r>
+        <w:t>я или полиномиальная регрессия.</w:t>
+      </w:r>
+    </w:p>
+    <w:p>
+      <w:pPr>
+        <w:ind w:firstLine="709"/>
+        <w:jc w:val="both"/>
+      </w:pPr>
+      <w:r>
+        <w:t>Нажмите «Обучить модель» — появя</w:t>
+      </w:r>
+      <w:r>
+        <w:t>тся метрики качества (R², MAE).</w:t>
+      </w:r>
+    </w:p>
+    <w:p>
+      <w:pPr>
+        <w:ind w:firstLine="709"/>
+        <w:jc w:val="both"/>
+      </w:pPr>
+      <w:r>
+        <w:t>Для ручного прогноза введите значения признаков (цена топлива, длина маршрута, праздник, количество автобу</w:t>
+      </w:r>
+      <w:r>
+        <w:t>сов, погода).</w:t>
+      </w:r>
+    </w:p>
+    <w:p>
+      <w:pPr>
+        <w:ind w:firstLine="709"/>
+        <w:jc w:val="both"/>
+      </w:pPr>
+      <w:r>
+        <w:t>Нажмите «Получить прогноз» — сис</w:t>
+      </w:r>
+      <w:r>
+        <w:t>тема покажет ожидаемую выручку.</w:t>
+      </w:r>
+    </w:p>
+    <w:p>
+      <w:pPr>
+        <w:ind w:firstLine="709"/>
+        <w:jc w:val="both"/>
+      </w:pPr>
+      <w:r>
+        <w:t>Для анализа зависимости: выберите признак, задайте диапаз</w:t>
+      </w:r>
+      <w:r>
+        <w:t>он, нажмите «Построить график».</w:t>
+      </w:r>
+    </w:p>
+    <w:p>
+      <w:pPr>
+        <w:ind w:firstLine="709"/>
+        <w:jc w:val="both"/>
+      </w:pPr>
+      <w:r>
+        <w:t>Вкладка «Оптимизация перевозок»</w:t>
+      </w:r>
+    </w:p>
+    <w:p>
+      <w:pPr>
+        <w:ind w:firstLine="709"/>
+        <w:jc w:val="both"/>
+      </w:pPr>
+      <w:r>
+        <w:t>При необходимости отредактируйте матрицу затрат, запасы авт</w:t>
+      </w:r>
+      <w:r>
+        <w:t>обусов и потребности маршрутов.</w:t>
+      </w:r>
+    </w:p>
+    <w:p>
+      <w:pPr>
+        <w:ind w:firstLine="709"/>
+        <w:jc w:val="both"/>
+      </w:pPr>
+      <w:r>
+        <w:t xml:space="preserve">Нажмите </w:t>
+      </w:r>
+      <w:r>
+        <w:t>«Оптимизировать распределение».</w:t>
+      </w:r>
+    </w:p>
+    <w:p>
+      <w:pPr>
+        <w:ind w:firstLine="709"/>
+        <w:jc w:val="both"/>
+      </w:pPr>
+      <w:r>
+        <w:t>Система выведет минимальные затраты и таблицу распределения рейсов.</w:t>
       </w:r>
     </w:p>
     <w:p>
@@ -2956,12 +5465,14 @@
         <w:pStyle w:val="1"/>
         <w:jc w:val="center"/>
       </w:pPr>
-      <w:bookmarkStart w:id="9" w:name="_Toc229241537"/>
+      <w:bookmarkStart w:id="18" w:name="_Toc229241537"/>
+      <w:bookmarkStart w:id="19" w:name="_Toc229738220"/>
       <w:r>
         <w:lastRenderedPageBreak/>
         <w:t>ЗАКЛЮЧЕНИЕ</w:t>
       </w:r>
-      <w:bookmarkEnd w:id="9"/>
+      <w:bookmarkEnd w:id="18"/>
+      <w:bookmarkEnd w:id="19"/>
     </w:p>
     <w:p>
       <w:pPr>
@@ -3103,12 +5614,14 @@
         <w:pStyle w:val="1"/>
         <w:jc w:val="center"/>
       </w:pPr>
-      <w:bookmarkStart w:id="10" w:name="_Toc229241538"/>
+      <w:bookmarkStart w:id="20" w:name="_Toc229241538"/>
+      <w:bookmarkStart w:id="21" w:name="_Toc229738221"/>
       <w:r>
         <w:lastRenderedPageBreak/>
         <w:t>СПИСОК ИСПОЛЬЗОВАННЫХ ИСТОЧНИКОВ</w:t>
       </w:r>
-      <w:bookmarkEnd w:id="10"/>
+      <w:bookmarkEnd w:id="20"/>
+      <w:bookmarkEnd w:id="21"/>
     </w:p>
     <w:p>
       <w:r>
@@ -3120,14 +5633,136 @@
         <w:pStyle w:val="1"/>
         <w:jc w:val="center"/>
       </w:pPr>
-      <w:bookmarkStart w:id="11" w:name="_Toc229241539"/>
+      <w:bookmarkStart w:id="22" w:name="_Toc229241539"/>
+      <w:bookmarkStart w:id="23" w:name="_Toc229738222"/>
       <w:r>
         <w:lastRenderedPageBreak/>
         <w:t>ПРИЛОЖЕНИЕ А</w:t>
       </w:r>
-      <w:bookmarkEnd w:id="11"/>
+      <w:bookmarkEnd w:id="22"/>
+      <w:bookmarkEnd w:id="23"/>
     </w:p>
     <w:p/>
+    <w:p>
+      <w:pPr>
+        <w:ind w:firstLine="709"/>
+        <w:jc w:val="both"/>
+      </w:pPr>
+      <w:r>
+        <w:t xml:space="preserve">Ссылка на </w:t>
+      </w:r>
+      <w:proofErr w:type="spellStart"/>
+      <w:r>
+        <w:t>репозиторий</w:t>
+      </w:r>
+      <w:proofErr w:type="spellEnd"/>
+      <w:r>
+        <w:t xml:space="preserve"> </w:t>
+      </w:r>
+      <w:proofErr w:type="spellStart"/>
+      <w:r>
+        <w:t>GitHub</w:t>
+      </w:r>
+      <w:proofErr w:type="spellEnd"/>
+      <w:r>
+        <w:t xml:space="preserve"> с открытым доступом для всех</w:t>
+      </w:r>
+      <w:r>
+        <w:t>: https://github.</w:t>
+      </w:r>
+      <w:r>
+        <w:t>com/Ju5TShur1k/Python_Kursovaya</w:t>
+      </w:r>
+    </w:p>
+    <w:p>
+      <w:pPr>
+        <w:ind w:firstLine="709"/>
+        <w:jc w:val="both"/>
+      </w:pPr>
+      <w:r>
+        <w:t xml:space="preserve">Основные файлы </w:t>
+      </w:r>
+      <w:proofErr w:type="spellStart"/>
+      <w:r>
+        <w:t>репозитория</w:t>
+      </w:r>
+      <w:proofErr w:type="spellEnd"/>
+      <w:r>
+        <w:t>:</w:t>
+      </w:r>
+    </w:p>
+    <w:p>
+      <w:pPr>
+        <w:ind w:firstLine="709"/>
+        <w:jc w:val="both"/>
+      </w:pPr>
+      <w:r>
+        <w:t>ma</w:t>
+      </w:r>
+      <w:r>
+        <w:t>in.py — точка входа в программу</w:t>
+      </w:r>
+    </w:p>
+    <w:p>
+      <w:pPr>
+        <w:ind w:firstLine="709"/>
+        <w:jc w:val="both"/>
+      </w:pPr>
+      <w:r>
+        <w:t>config.</w:t>
+      </w:r>
+      <w:r>
+        <w:t>py — конфигурационные параметры</w:t>
+      </w:r>
+    </w:p>
+    <w:p>
+      <w:pPr>
+        <w:ind w:firstLine="709"/>
+        <w:jc w:val="both"/>
+      </w:pPr>
+      <w:proofErr w:type="spellStart"/>
+      <w:r>
+        <w:t>mod</w:t>
+      </w:r>
+      <w:r>
+        <w:t>ules</w:t>
+      </w:r>
+      <w:proofErr w:type="spellEnd"/>
+      <w:r>
+        <w:t>/ — модули с бизнес-логикой</w:t>
+      </w:r>
+    </w:p>
+    <w:p>
+      <w:pPr>
+        <w:ind w:firstLine="709"/>
+        <w:jc w:val="both"/>
+      </w:pPr>
+      <w:proofErr w:type="spellStart"/>
+      <w:r>
+        <w:t>ui</w:t>
+      </w:r>
+      <w:proofErr w:type="spellEnd"/>
+      <w:r>
+        <w:t>/ — моду</w:t>
+      </w:r>
+      <w:r>
+        <w:t>ли пользовательского интерфейса</w:t>
+      </w:r>
+    </w:p>
+    <w:p>
+      <w:pPr>
+        <w:ind w:firstLine="709"/>
+        <w:jc w:val="both"/>
+      </w:pPr>
+      <w:proofErr w:type="spellStart"/>
+      <w:r>
+        <w:t>utils</w:t>
+      </w:r>
+      <w:proofErr w:type="spellEnd"/>
+      <w:r>
+        <w:t>/ — утилиты для загрузки данных</w:t>
+      </w:r>
+    </w:p>
     <w:p/>
     <w:p/>
     <w:p/>
@@ -5042,7 +7677,7 @@
   <w:style w:type="paragraph" w:default="1" w:styleId="a0">
     <w:name w:val="Normal"/>
     <w:qFormat/>
-    <w:rsid w:val="00700498"/>
+    <w:rsid w:val="00B8269D"/>
     <w:pPr>
       <w:spacing w:after="0" w:line="360" w:lineRule="auto"/>
     </w:pPr>
@@ -5718,6 +8353,29 @@
       <w:bCs/>
     </w:rPr>
   </w:style>
+  <w:style w:type="paragraph" w:styleId="11">
+    <w:name w:val="toc 1"/>
+    <w:basedOn w:val="a0"/>
+    <w:next w:val="a0"/>
+    <w:autoRedefine/>
+    <w:uiPriority w:val="39"/>
+    <w:unhideWhenUsed/>
+    <w:rsid w:val="00895A7A"/>
+    <w:pPr>
+      <w:spacing w:after="100"/>
+    </w:pPr>
+  </w:style>
+  <w:style w:type="character" w:styleId="af2">
+    <w:name w:val="Hyperlink"/>
+    <w:basedOn w:val="a1"/>
+    <w:uiPriority w:val="99"/>
+    <w:unhideWhenUsed/>
+    <w:rsid w:val="00895A7A"/>
+    <w:rPr>
+      <w:color w:val="467886" w:themeColor="hyperlink"/>
+      <w:u w:val="single"/>
+    </w:rPr>
+  </w:style>
 </w:styles>
 </file>
 

</xml_diff>